<commit_message>
docs: restore dynamic commerce contract traceability
</commit_message>
<xml_diff>
--- a/docs/VESKIFY_SDD_v1.3.0.docx
+++ b/docs/VESKIFY_SDD_v1.3.0.docx
@@ -3954,6 +3954,168 @@
           <w:rFonts w:ascii="Calibri" w:hAnsi="Calibri" w:cs="Calibri"/>
         </w:rPr>
         <w:t>The same registered implementation renders in editor, preview, and published routes. Components must be keyboard accessible and responsive at 375, 768, 1024, and 1440 px. Product pages render all option groups supplied by canonical commerce, resolve selected variant price, availability, and media without mutation, handle incomplete and unavailable selections, and retain unknown attributes through a safe generic fallback.</w:t>
+      </w:r>
+    </w:p>
+    <w:p>
+      <w:pPr>
+        <w:pStyle w:val="Heading2"/>
+        <w:keepNext/>
+        <w:widowControl/>
+      </w:pPr>
+      <w:r>
+        <w:rPr>
+          <w:rFonts w:ascii="Calibri" w:hAnsi="Calibri" w:cs="Calibri"/>
+        </w:rPr>
+        <w:t>7.5 Registered dynamicCollectionCommerce contract</w:t>
+      </w:r>
+    </w:p>
+    <w:p>
+      <w:pPr>
+        <w:pStyle w:val="Normal"/>
+        <w:widowControl/>
+      </w:pPr>
+      <w:r>
+        <w:rPr>
+          <w:rFonts w:ascii="Calibri" w:hAnsi="Calibri" w:cs="Calibri"/>
+        </w:rPr>
+        <w:t xml:space="preserve">The registered </w:t>
+      </w:r>
+      <w:r>
+        <w:rPr>
+          <w:rFonts w:ascii="Consolas" w:hAnsi="Consolas" w:cs="Consolas"/>
+          <w:sz w:val="19"/>
+          <w:szCs w:val="19"/>
+        </w:rPr>
+        <w:t>dynamicCollectionCommerce</w:t>
+      </w:r>
+      <w:r>
+        <w:rPr>
+          <w:rFonts w:ascii="Calibri" w:hAnsi="Calibri" w:cs="Calibri"/>
+        </w:rPr>
+        <w:t xml:space="preserve"> component uses a required, revision-bound </w:t>
+      </w:r>
+      <w:r>
+        <w:rPr>
+          <w:rFonts w:ascii="Consolas" w:hAnsi="Consolas" w:cs="Consolas"/>
+          <w:sz w:val="19"/>
+          <w:szCs w:val="19"/>
+        </w:rPr>
+        <w:t>primaryCollection</w:t>
+      </w:r>
+      <w:r>
+        <w:rPr>
+          <w:rFonts w:ascii="Calibri" w:hAnsi="Calibri" w:cs="Calibri"/>
+        </w:rPr>
+        <w:t xml:space="preserve"> binding for the exact canonical collection identity and revision, and a required, revision-bound </w:t>
+      </w:r>
+      <w:r>
+        <w:rPr>
+          <w:rFonts w:ascii="Consolas" w:hAnsi="Consolas" w:cs="Consolas"/>
+          <w:sz w:val="19"/>
+          <w:szCs w:val="19"/>
+        </w:rPr>
+        <w:t>collectionProducts</w:t>
+      </w:r>
+      <w:r>
+        <w:rPr>
+          <w:rFonts w:ascii="Calibri" w:hAnsi="Calibri" w:cs="Calibri"/>
+        </w:rPr>
+        <w:t xml:space="preserve"> binding for its exact canonical ordered product membership. Where applicable, the optional </w:t>
+      </w:r>
+      <w:r>
+        <w:rPr>
+          <w:rFonts w:ascii="Consolas" w:hAnsi="Consolas" w:cs="Consolas"/>
+          <w:sz w:val="19"/>
+          <w:szCs w:val="19"/>
+        </w:rPr>
+        <w:t>childCollections</w:t>
+      </w:r>
+      <w:r>
+        <w:rPr>
+          <w:rFonts w:ascii="Calibri" w:hAnsi="Calibri" w:cs="Calibri"/>
+        </w:rPr>
+        <w:t xml:space="preserve"> binding carries the ordered canonical child-collection list. Filtering and sorting interactions emit typed presentation intents rather than mutating canonical commerce truth. Collection membership, price, stock, availability, and canonical media remain protected, and the same registered component renders through editor, preview, and published targets.</w:t>
+      </w:r>
+    </w:p>
+    <w:p>
+      <w:pPr>
+        <w:pStyle w:val="Heading2"/>
+        <w:keepNext/>
+        <w:widowControl/>
+      </w:pPr>
+      <w:r>
+        <w:rPr>
+          <w:rFonts w:ascii="Calibri" w:hAnsi="Calibri" w:cs="Calibri"/>
+        </w:rPr>
+        <w:t>7.6 Registered dynamicProductDetail contract</w:t>
+      </w:r>
+    </w:p>
+    <w:p>
+      <w:pPr>
+        <w:pStyle w:val="Normal"/>
+        <w:widowControl/>
+      </w:pPr>
+      <w:r>
+        <w:rPr>
+          <w:rFonts w:ascii="Calibri" w:hAnsi="Calibri" w:cs="Calibri"/>
+        </w:rPr>
+        <w:t xml:space="preserve">The registered </w:t>
+      </w:r>
+      <w:r>
+        <w:rPr>
+          <w:rFonts w:ascii="Consolas" w:hAnsi="Consolas" w:cs="Consolas"/>
+          <w:sz w:val="19"/>
+          <w:szCs w:val="19"/>
+        </w:rPr>
+        <w:t>dynamicProductDetail</w:t>
+      </w:r>
+      <w:r>
+        <w:rPr>
+          <w:rFonts w:ascii="Calibri" w:hAnsi="Calibri" w:cs="Calibri"/>
+        </w:rPr>
+        <w:t xml:space="preserve"> component uses a required, revision-bound </w:t>
+      </w:r>
+      <w:r>
+        <w:rPr>
+          <w:rFonts w:ascii="Consolas" w:hAnsi="Consolas" w:cs="Consolas"/>
+          <w:sz w:val="19"/>
+          <w:szCs w:val="19"/>
+        </w:rPr>
+        <w:t>primaryProduct</w:t>
+      </w:r>
+      <w:r>
+        <w:rPr>
+          <w:rFonts w:ascii="Calibri" w:hAnsi="Calibri" w:cs="Calibri"/>
+        </w:rPr>
+        <w:t xml:space="preserve"> binding for the exact canonical product identity and revision. Its optional </w:t>
+      </w:r>
+      <w:r>
+        <w:rPr>
+          <w:rFonts w:ascii="Consolas" w:hAnsi="Consolas" w:cs="Consolas"/>
+          <w:sz w:val="19"/>
+          <w:szCs w:val="19"/>
+        </w:rPr>
+        <w:t>relatedProducts</w:t>
+      </w:r>
+      <w:r>
+        <w:rPr>
+          <w:rFonts w:ascii="Calibri" w:hAnsi="Calibri" w:cs="Calibri"/>
+        </w:rPr>
+        <w:t xml:space="preserve"> binding carries the ordered canonical related-product list, while </w:t>
+      </w:r>
+      <w:r>
+        <w:rPr>
+          <w:rFonts w:ascii="Consolas" w:hAnsi="Consolas" w:cs="Consolas"/>
+          <w:sz w:val="19"/>
+          <w:szCs w:val="19"/>
+        </w:rPr>
+        <w:t>productMedia</w:t>
+      </w:r>
+      <w:r>
+        <w:rPr>
+          <w:rFonts w:ascii="Calibri" w:hAnsi="Calibri" w:cs="Calibri"/>
+        </w:rPr>
+        <w:t xml:space="preserve"> remains the canonical protected product-media authority. Option selection uses the existing P6 option-resolution engine. The component emits typed selection and primary-action intent rather than mutating price, SKU, stock, availability, variants, or media. Unsupported or unknown option structures retain the generic option architecture, and the same registered component renders through editor, preview, and published targets.</w:t>
       </w:r>
     </w:p>
     <w:p>

</xml_diff>

<commit_message>
feat: add prompted storefront design intent v2
</commit_message>
<xml_diff>
--- a/docs/VESKIFY_SDD_v1.3.0.docx
+++ b/docs/VESKIFY_SDD_v1.3.0.docx
@@ -51,7 +51,7 @@
         <w:rPr>
           <w:rFonts w:ascii="Calibri" w:hAnsi="Calibri" w:cs="Calibri"/>
         </w:rPr>
-        <w:t>P10B-16P-01 dynamic commerce route archetype authority</w:t>
+        <w:t>P10B-16P-02A prompted Storefront Design Intent V2 authority</w:t>
       </w:r>
     </w:p>
     <w:p>
@@ -284,7 +284,7 @@
               <w:rPr>
                 <w:rFonts w:ascii="Calibri" w:hAnsi="Calibri" w:cs="Calibri"/>
               </w:rPr>
-              <w:t>11 August 2026, P10B-16P-01 dynamic commerce route archetype authority</w:t>
+              <w:t>11 August 2026, P10B-16P-02A prompted Storefront Design Intent V2 authority</w:t>
             </w:r>
           </w:p>
         </w:tc>
@@ -708,6 +708,83 @@
               <w:rPr>
                 <w:rFonts w:ascii="Calibri" w:hAnsi="Calibri" w:cs="Calibri"/>
               </w:rPr>
+              <w:t>1.3.0 P10B-16P-02A</w:t>
+            </w:r>
+          </w:p>
+        </w:tc>
+        <w:tc>
+          <w:tcPr>
+            <w:tcW w:w="1500" w:type="dxa"/>
+            <w:vAlign w:val="center"/>
+          </w:tcPr>
+          <w:p>
+            <w:pPr>
+              <w:pStyle w:val="TableText"/>
+              <w:jc w:val="center"/>
+              <w:widowControl/>
+            </w:pPr>
+            <w:r>
+              <w:rPr>
+                <w:rFonts w:ascii="Calibri" w:hAnsi="Calibri" w:cs="Calibri"/>
+              </w:rPr>
+              <w:t>11 August 2026</w:t>
+            </w:r>
+          </w:p>
+        </w:tc>
+        <w:tc>
+          <w:tcPr>
+            <w:tcW w:w="2000" w:type="dxa"/>
+            <w:vAlign w:val="center"/>
+          </w:tcPr>
+          <w:p>
+            <w:pPr>
+              <w:pStyle w:val="TableText"/>
+              <w:widowControl/>
+            </w:pPr>
+            <w:r>
+              <w:rPr>
+                <w:rFonts w:ascii="Calibri" w:hAnsi="Calibri" w:cs="Calibri"/>
+              </w:rPr>
+              <w:t>P10B-16P-02A delivery</w:t>
+            </w:r>
+          </w:p>
+        </w:tc>
+        <w:tc>
+          <w:tcPr>
+            <w:tcW w:w="4860" w:type="dxa"/>
+            <w:vAlign w:val="center"/>
+          </w:tcPr>
+          <w:p>
+            <w:pPr>
+              <w:pStyle w:val="TableText"/>
+              <w:widowControl/>
+            </w:pPr>
+            <w:r>
+              <w:rPr>
+                <w:rFonts w:ascii="Calibri" w:hAnsi="Calibri" w:cs="Calibri"/>
+              </w:rPr>
+              <w:t>Establish the strict transient provider-safe capability projection, prompted request, preference-rich Design Intent V2, exact capability-reference validation, deterministic fingerprints, server-only OpenAI adapter and safe mocked-transport evidence without compiling or materializing a storefront before the provider response.</w:t>
+            </w:r>
+          </w:p>
+        </w:tc>
+      </w:tr>
+      <w:tr>
+        <w:trPr/>
+        <w:tc>
+          <w:tcPr>
+            <w:tcW w:w="1000" w:type="dxa"/>
+            <w:vAlign w:val="center"/>
+          </w:tcPr>
+          <w:p>
+            <w:pPr>
+              <w:pStyle w:val="TableText"/>
+              <w:jc w:val="center"/>
+              <w:widowControl/>
+            </w:pPr>
+            <w:r>
+              <w:rPr>
+                <w:rFonts w:ascii="Calibri" w:hAnsi="Calibri" w:cs="Calibri"/>
+              </w:rPr>
               <w:t>1.3.0 P10B-16P-01</w:t>
             </w:r>
           </w:p>
@@ -2700,7 +2777,7 @@
         <w:rPr>
           <w:rFonts w:ascii="Calibri" w:hAnsi="Calibri" w:cs="Calibri"/>
         </w:rPr>
-        <w:t>: P10B-01 commercial grammar, P10B-02 parametric BrandSystem / Design DNA, P10B-03 component anatomy, P10B-04 responsive image/art-direction authority, P10B-05 site-map/page-family authority, P10B-06 commercial shared-frame families, P10B-07 hero/editorial/campaign/proof families, P10B-08 canonical product-card authority, P10B-09 commercial homepage profiles, and P10B-10 commercial collection/search profiles, P10B-11 commercial PDP profiles, P10B-12 content/support page families, P10B-13 commerce utility presentation, the P10B-14 Premium Editorial complete-storefront vertical slice, the P10B-15 bounded synthesis engine, P10B-16 direction/diversity authority, and P10B-16P-01 dynamic commerce route archetype authority are Baseline. P10B-16P-02, P10B-16P-03, P10B-17, and P10B-18 remain Planned. The current merchant editor does not yet expose the governed routing and scoped editing authorities; that is intentionally P10C work, not a P10A closure requirement.</w:t>
+        <w:t>: P10B-01 commercial grammar, P10B-02 parametric BrandSystem / Design DNA, P10B-03 component anatomy, P10B-04 responsive image/art-direction authority, P10B-05 site-map/page-family authority, P10B-06 commercial shared-frame families, P10B-07 hero/editorial/campaign/proof families, P10B-08 canonical product-card authority, P10B-09 commercial homepage profiles, and P10B-10 commercial collection/search profiles, P10B-11 commercial PDP profiles, P10B-12 content/support page families, P10B-13 commerce utility presentation, the P10B-14 Premium Editorial complete-storefront vertical slice, the P10B-15 bounded synthesis engine, P10B-16 direction/diversity authority, and P10B-16P-01 dynamic commerce route archetype authority, and P10B-16P-02A prompted Design Intent V2 authority are Baseline. P10B-16P-02 is Partial; P10B-16P-02B, P10B-16P-03, P10B-16P-04, P10B-17, and P10B-18 remain Planned. The current merchant editor does not yet expose the governed routing and scoped editing authorities; that is intentionally P10C work, not a P10A closure requirement.</w:t>
       </w:r>
     </w:p>
     <w:p>
@@ -4888,7 +4965,7 @@
               <w:rPr>
                 <w:rFonts w:ascii="Calibri" w:hAnsi="Calibri" w:cs="Calibri"/>
               </w:rPr>
-              <w:t>P10B-01 through P10B-14 provide the commercial grammar, Design DNA, assets, page/frame/component/profile/utility authorities and first complete 17-route proof; P10B-15 generalizes them into deterministic bounded complete-store synthesis; P10B-16 adds three coordinated constraint packages, structural diversity classification and repetition control; P10B-16P-01 replaces copied commerce-route design pages with one maintained dynamic-archetype authority. P10B-16P-02, P10B-16P-03, phase-wide responsive/performance, and 100+ quality/scale closure remain Planned.</w:t>
+              <w:t>P10B-01 through P10B-14 provide the commercial grammar, Design DNA, assets, page/frame/component/profile/utility authorities and first complete 17-route proof; P10B-15 generalizes them into deterministic bounded complete-store synthesis; P10B-16 adds three coordinated constraint packages, structural diversity classification and repetition control; P10B-16P-01 replaces copied commerce-route design pages with one maintained dynamic-archetype authority; P10B-16P-02A adds the strict transient prompted Design Intent V2 boundary. Deterministic intent compilation, Studio wiring, live V2 acceptance, phase-wide responsive/performance, and 100+ quality/scale closure remain Planned.</w:t>
             </w:r>
           </w:p>
         </w:tc>
@@ -5320,6 +5397,46 @@
           <w:rFonts w:ascii="Calibri" w:hAnsi="Calibri" w:cs="Calibri"/>
         </w:rPr>
         <w:t>P10A-07C-03R controlled real-provider acceptance completed on 7 August 2026 through an explicitly authorized eligible trusted OpenAI configuration. One initial-generation case succeeded before one hero follow-up case; each used one provider call, neither retried, safe evidence was retained, and no save or publication occurred.</w:t>
+      </w:r>
+    </w:p>
+    <w:p>
+      <w:pPr>
+        <w:pStyle w:val="Normal"/>
+        <w:widowControl/>
+      </w:pPr>
+      <w:r>
+        <w:rPr>
+          <w:rFonts w:ascii="Calibri" w:hAnsi="Calibri" w:cs="Calibri"/>
+        </w:rPr>
+        <w:t xml:space="preserve">The later P10B-16L OpenAI path is separately scoped compatibility authority. Its retained authorized call used the earlier v1 direction/posture contract, completed the strict provider result, and then failed coordinated synthesis with safe code </w:t>
+      </w:r>
+      <w:r>
+        <w:rPr>
+          <w:rFonts w:ascii="Consolas" w:hAnsi="Consolas" w:cs="Consolas"/>
+          <w:sz w:val="19"/>
+          <w:szCs w:val="19"/>
+        </w:rPr>
+        <w:t>malformed-state</w:t>
+      </w:r>
+      <w:r>
+        <w:rPr>
+          <w:rFonts w:ascii="Calibri" w:hAnsi="Calibri" w:cs="Calibri"/>
+        </w:rPr>
+        <w:t xml:space="preserve">. The corrected v2 compatibility path now pre-executes and materializes compatible storefront candidates before asking the provider to select an advertised </w:t>
+      </w:r>
+      <w:r>
+        <w:rPr>
+          <w:rFonts w:ascii="Consolas" w:hAnsi="Consolas" w:cs="Consolas"/>
+          <w:sz w:val="19"/>
+          <w:szCs w:val="19"/>
+        </w:rPr>
+        <w:t>executableIntentId</w:t>
+      </w:r>
+      <w:r>
+        <w:rPr>
+          <w:rFonts w:ascii="Calibri" w:hAnsi="Calibri" w:cs="Calibri"/>
+        </w:rPr>
+        <w:t>, but that corrected path has made zero live calls. Neither path is prompt-driven storefront generation. P10B-16P-02A instead defines a strict non-executable preference-rich Design Intent V2 before any complete-store execution; no live V2 provider call has occurred.</w:t>
       </w:r>
     </w:p>
     <w:p>
@@ -7969,7 +8086,7 @@
         <w:rPr>
           <w:rFonts w:ascii="Calibri" w:hAnsi="Calibri" w:cs="Calibri"/>
         </w:rPr>
-        <w:t>This establishes one representative complete store. P10B-15 generalizes that convergence path, P10B-16 governs direction/diversity authority, and P10B-16P-01 preserves the same route coverage while converging collection/search/PDP design into maintained root archetypes. P10B-16P-02 and P10B-16P-03 remain the prompted-plan and Studio-generation sequence before P10B-17 phase-wide responsive/accessibility/performance closure and P10B-18 repeated quality-and-scale gate.</w:t>
+        <w:t>This establishes one representative complete store. P10B-15 generalizes that convergence path, P10B-16 governs direction/diversity authority, and P10B-16P-01 preserves the same route coverage while converging collection/search/PDP design into maintained root archetypes. P10B-16P-02A now provides the strict transient prompted intent boundary. P10B-16P-02B deterministic compilation, P10B-16P-03 Studio wiring and P10B-16P-04 live V2 acceptance/bridge disposition remain sequential before P10B-17 phase-wide responsive/accessibility/performance closure and P10B-18 repeated quality-and-scale gate.</w:t>
       </w:r>
     </w:p>
     <w:p>
@@ -8336,7 +8453,7 @@
         <w:rPr>
           <w:rFonts w:ascii="Calibri" w:hAnsi="Calibri" w:cs="Calibri"/>
         </w:rPr>
-        <w:t>P10B-16P-01 is Baseline. P10B-16P-02 owns the separately governed prompted design-plan contract, and P10B-16P-03 owns the final Storefront Studio generation journey; both remain Planned.</w:t>
+        <w:t>P10B-16P-01 is Baseline. P10B-16P-02A owns the strict transient prompted Design Intent V2 boundary and is Baseline. P10B-16P-02 is Partial; Part B compilation, final Storefront Studio wiring and live V2 acceptance remain Planned under P10B-16P-02B, P10B-16P-03 and P10B-16P-04.</w:t>
       </w:r>
     </w:p>
     <w:p>
@@ -8349,7 +8466,150 @@
         <w:rPr>
           <w:rFonts w:ascii="Calibri" w:hAnsi="Calibri" w:cs="Calibri"/>
         </w:rPr>
-        <w:t>10.19 Remaining planned commercial generation authority</w:t>
+        <w:t>10.19 P10B-16P-02A prompted Storefront Design Intent V2 authority</w:t>
+      </w:r>
+    </w:p>
+    <w:p>
+      <w:pPr>
+        <w:pStyle w:val="Normal"/>
+        <w:widowControl/>
+      </w:pPr>
+      <w:r>
+        <w:rPr>
+          <w:rFonts w:ascii="Calibri" w:hAnsi="Calibri" w:cs="Calibri"/>
+        </w:rPr>
+        <w:t>P10B-16P-02A adds a compact deterministic provider-safe projection over current Design DNA, shared-frame, PageBlueprint/profile, component/anatomy, dynamic-commerce archetype, content/utility, responsive and art-direction authority. Stable preference keys carry dimension, context, availability and server-retained current-authority references without creating another registry, plan or page graph. Search is represented truthfully as registered presentation authority whose runtime remains fail closed until a first-class canonical query/results adapter exists.</w:t>
+      </w:r>
+    </w:p>
+    <w:p>
+      <w:pPr>
+        <w:pStyle w:val="Normal"/>
+        <w:widowControl/>
+      </w:pPr>
+      <w:r>
+        <w:rPr>
+          <w:rFonts w:ascii="Calibri" w:hAnsi="Calibri" w:cs="Calibri"/>
+        </w:rPr>
+        <w:t>The strict versioned request binds the exact unchanged merchant prompt and deterministic prompt, request, project/draft/snapshot, dynamic-commerce, capability, PageBlueprint, Design DNA, brief/evidence, asset and aggregate catalogue/commerce fingerprints. It includes approved safe merchant context, bounded catalogue/product-type characteristics, evidence/asset availability and compact capabilities. Full products, prices, stock, customers, orders, raw media, unnecessary raw evidence, credentials and authorization data are excluded.</w:t>
+      </w:r>
+    </w:p>
+    <w:p>
+      <w:pPr>
+        <w:pStyle w:val="Normal"/>
+        <w:widowControl/>
+      </w:pPr>
+      <w:r>
+        <w:rPr>
+          <w:rFonts w:ascii="Calibri" w:hAnsi="Calibri" w:cs="Calibri"/>
+        </w:rPr>
+        <w:t xml:space="preserve">The strict closed result is transient, untrusted, non-canonical and non-executable. It expresses hard merchant constraints, ranked soft preferences, optional suggestions and avoidances across Design DNA, frame, homepage narrative, collection/search and PDP archetypes, canonical aggregate product-type posture, content/support, registered component/meaningful variants, bounded parameters, responsive behavior and approved art direction. It cannot emit an </w:t>
+      </w:r>
+      <w:r>
+        <w:rPr>
+          <w:rFonts w:ascii="Consolas" w:hAnsi="Consolas" w:cs="Consolas"/>
+          <w:sz w:val="19"/>
+          <w:szCs w:val="19"/>
+        </w:rPr>
+        <w:t>executableIntentId</w:t>
+      </w:r>
+      <w:r>
+        <w:rPr>
+          <w:rFonts w:ascii="Calibri" w:hAnsi="Calibri" w:cs="Calibri"/>
+        </w:rPr>
+        <w:t xml:space="preserve">, arbitrary route/page/section tree, concrete product or collection design entry, component, code, CSS, commerce value, proposal, PageBlueprint or </w:t>
+      </w:r>
+      <w:r>
+        <w:rPr>
+          <w:rFonts w:ascii="Consolas" w:hAnsi="Consolas" w:cs="Consolas"/>
+          <w:sz w:val="19"/>
+          <w:szCs w:val="19"/>
+        </w:rPr>
+        <w:t>StorefrontSnapshot</w:t>
+      </w:r>
+      <w:r>
+        <w:rPr>
+          <w:rFonts w:ascii="Calibri" w:hAnsi="Calibri" w:cs="Calibri"/>
+        </w:rPr>
+        <w:t>.</w:t>
+      </w:r>
+    </w:p>
+    <w:p>
+      <w:pPr>
+        <w:pStyle w:val="Normal"/>
+        <w:widowControl/>
+      </w:pPr>
+      <w:r>
+        <w:rPr>
+          <w:rFonts w:ascii="Calibri" w:hAnsi="Calibri" w:cs="Calibri"/>
+        </w:rPr>
+        <w:t>After strict schema parsing, every preference must match a key advertised by that exact request, use the dimension required by its result field and retain valid availability. Context metadata is preserved for P10B-16P-02B compatibility resolution. Unknown, invented, wrong-dimension, concrete-route, unavailable required, fingerprint-mismatched or stale references fail without fuzzy repair, named-preset substitution, retry, fallback or partial result. Normalization makes the projection, request and intent fingerprints stable under unordered source iteration; all material preference semantics affect the intent fingerprint.</w:t>
+      </w:r>
+    </w:p>
+    <w:p>
+      <w:pPr>
+        <w:pStyle w:val="Normal"/>
+        <w:widowControl/>
+      </w:pPr>
+      <w:r>
+        <w:rPr>
+          <w:rFonts w:ascii="Calibri" w:hAnsi="Calibri" w:cs="Calibri"/>
+        </w:rPr>
+        <w:t xml:space="preserve">The server-only OpenAI adapter uses strict structured output, </w:t>
+      </w:r>
+      <w:r>
+        <w:rPr>
+          <w:rFonts w:ascii="Consolas" w:hAnsi="Consolas" w:cs="Consolas"/>
+          <w:sz w:val="19"/>
+          <w:szCs w:val="19"/>
+        </w:rPr>
+        <w:t>store: false</w:t>
+      </w:r>
+      <w:r>
+        <w:rPr>
+          <w:rFonts w:ascii="Calibri" w:hAnsi="Calibri" w:cs="Calibri"/>
+        </w:rPr>
+        <w:t>, zero SDK and application retries, one bounded-time transport attempt, no repair call/fallback, exact fingerprint verification and safe refusal/timeout/transport/malformed/schema/reference/stale classification. Only safe provider/model, call/retry, fingerprint, bounded usage and outcome metadata may be retained; raw prompts, provider bodies, credentials and headers are not logged or retained.</w:t>
+      </w:r>
+    </w:p>
+    <w:p>
+      <w:pPr>
+        <w:pStyle w:val="Normal"/>
+        <w:widowControl/>
+      </w:pPr>
+      <w:r>
+        <w:rPr>
+          <w:rFonts w:ascii="Calibri" w:hAnsi="Calibri" w:cs="Calibri"/>
+        </w:rPr>
+        <w:t xml:space="preserve">Before the provider response, this path may calculate capability knowledge only. It cannot execute P10B-15, execute complete P10B-16 candidates, create a complete plan, materialize PageBlueprints, create proposal operations or construct a candidate snapshot. The prior P10B-16L real OpenAI call completed the earlier strict v1 direction/posture result and failed coordinated synthesis; the corrected executable-option bridge has made zero live calls. Neither is prompt-driven generation evidence. Part B owns deterministic post-provider compilation, P10B-16P-03 owns Studio wiring, and P10B-16P-04 owns live V2 acceptance and legacy bridge disposition. Full audit and contracts are in </w:t>
+      </w:r>
+      <w:hyperlink r:id="rIdHyperlink23" w:history="1">
+        <w:r>
+          <w:rPr>
+            <w:rFonts w:ascii="Calibri" w:hAnsi="Calibri" w:cs="Calibri"/>
+            <w:color w:val="2E74B5"/>
+            <w:u w:val="single"/>
+          </w:rPr>
+          <w:t>P10B_16P_02_PROMPTED_STOREFRONT_DESIGN_PLAN_V2.md</w:t>
+        </w:r>
+      </w:hyperlink>
+      <w:r>
+        <w:rPr>
+          <w:rFonts w:ascii="Calibri" w:hAnsi="Calibri" w:cs="Calibri"/>
+        </w:rPr>
+        <w:t>.</w:t>
+      </w:r>
+    </w:p>
+    <w:p>
+      <w:pPr>
+        <w:pStyle w:val="Heading2"/>
+        <w:keepNext/>
+        <w:widowControl/>
+      </w:pPr>
+      <w:r>
+        <w:rPr>
+          <w:rFonts w:ascii="Calibri" w:hAnsi="Calibri" w:cs="Calibri"/>
+        </w:rPr>
+        <w:t>10.20 Remaining planned commercial generation authority</w:t>
       </w:r>
     </w:p>
     <w:p>
@@ -8528,7 +8788,7 @@
         <w:rPr>
           <w:rFonts w:ascii="Calibri" w:hAnsi="Calibri" w:cs="Calibri"/>
         </w:rPr>
-        <w:t>10.20 Commercial acceptance</w:t>
+        <w:t>10.21 Commercial acceptance</w:t>
       </w:r>
     </w:p>
     <w:p>
@@ -8729,7 +8989,7 @@
         </w:rPr>
         <w:t xml:space="preserve">The Vesko OpenAPI 3.0 contract has been obtained and audited. It establishes real endpoint surfaces for store context, products, variants, categories, brands, media, inventory, Puck, and storefront product reads. See </w:t>
       </w:r>
-      <w:hyperlink r:id="rIdHyperlink23" w:history="1">
+      <w:hyperlink r:id="rIdHyperlink24" w:history="1">
         <w:r>
           <w:rPr>
             <w:rFonts w:ascii="Calibri" w:hAnsi="Calibri" w:cs="Calibri"/>
@@ -8745,7 +9005,7 @@
         </w:rPr>
         <w:t xml:space="preserve"> and </w:t>
       </w:r>
-      <w:hyperlink r:id="rIdHyperlink24" w:history="1">
+      <w:hyperlink r:id="rIdHyperlink25" w:history="1">
         <w:r>
           <w:rPr>
             <w:rFonts w:ascii="Calibri" w:hAnsi="Calibri" w:cs="Calibri"/>
@@ -9767,7 +10027,7 @@
         <w:rPr>
           <w:rFonts w:ascii="Calibri" w:hAnsi="Calibri" w:cs="Calibri"/>
         </w:rPr>
-        <w:t xml:space="preserve"> P10B-01 through P10B-16 and P10B-16P-01 are Baseline; P10B-16P-02, P10B-16P-03, P10B-17, and P10B-18 remain Planned. Deliver complete commercially credible storefronts with bounded material diversity through registered authority and retained human review.</w:t>
+        <w:t xml:space="preserve"> P10B-01 through P10B-16, P10B-16P-01, and P10B-16P-02A are Baseline; P10B-16P-02 is Partial; P10B-16P-02B, P10B-16P-03, P10B-16P-04, P10B-17, and P10B-18 remain Planned. Deliver complete commercially credible storefronts with bounded material diversity through registered authority and retained human review.</w:t>
       </w:r>
     </w:p>
     <w:p>
@@ -10215,7 +10475,35 @@
         <w:rPr>
           <w:rFonts w:ascii="Calibri" w:hAnsi="Calibri" w:cs="Calibri"/>
         </w:rPr>
-        <w:t>legacy product-card implementations duplicated outside the canonical commercial family;</w:t>
+        <w:t xml:space="preserve">P10B-16L </w:t>
+      </w:r>
+      <w:r>
+        <w:rPr>
+          <w:rFonts w:ascii="Consolas" w:hAnsi="Consolas" w:cs="Consolas"/>
+          <w:sz w:val="19"/>
+          <w:szCs w:val="19"/>
+        </w:rPr>
+        <w:t>executableIntentId</w:t>
+      </w:r>
+      <w:r>
+        <w:rPr>
+          <w:rFonts w:ascii="Calibri" w:hAnsi="Calibri" w:cs="Calibri"/>
+        </w:rPr>
+        <w:t xml:space="preserve"> selection and normal whole-storefront </w:t>
+      </w:r>
+      <w:r>
+        <w:rPr>
+          <w:rFonts w:ascii="Consolas" w:hAnsi="Consolas" w:cs="Consolas"/>
+          <w:sz w:val="19"/>
+          <w:szCs w:val="19"/>
+        </w:rPr>
+        <w:t>selectionId</w:t>
+      </w:r>
+      <w:r>
+        <w:rPr>
+          <w:rFonts w:ascii="Calibri" w:hAnsi="Calibri" w:cs="Calibri"/>
+        </w:rPr>
+        <w:t xml:space="preserve"> semantics for prompted initial generation after P10B-16P-04 proves V2 and explicitly disposes their compatibility use;</w:t>
       </w:r>
     </w:p>
     <w:p>
@@ -10231,44 +10519,7 @@
         <w:rPr>
           <w:rFonts w:ascii="Calibri" w:hAnsi="Calibri" w:cs="Calibri"/>
         </w:rPr>
-        <w:t>v1.2.2 phase descriptions that keep Phase 9 active or assign merchant editing outside P10C.</w:t>
-      </w:r>
-    </w:p>
-    <w:p>
-      <w:pPr>
-        <w:pStyle w:val="Normal"/>
-        <w:widowControl/>
-      </w:pPr>
-      <w:r>
-        <w:rPr>
-          <w:rFonts w:ascii="Calibri" w:hAnsi="Calibri" w:cs="Calibri"/>
-        </w:rPr>
-        <w:t>Migration must preserve canonical IDs, bindings, commerce truth, snapshot history, and published authority. An unresolved migration blocks compilation or rendering rather than silently dropping content or selecting a fallback variant. Legacy concrete commerce-route pages remain loadable, but convergence to root archetypes requires deterministic equality; materially different route presentations require an explicit typed migration decision.</w:t>
-      </w:r>
-    </w:p>
-    <w:p>
-      <w:pPr>
-        <w:pStyle w:val="Heading1"/>
-        <w:keepNext/>
-        <w:widowControl/>
-      </w:pPr>
-      <w:r>
-        <w:rPr>
-          <w:rFonts w:ascii="Calibri" w:hAnsi="Calibri" w:cs="Calibri"/>
-        </w:rPr>
-        <w:t>17. Explicit current non-claims</w:t>
-      </w:r>
-    </w:p>
-    <w:p>
-      <w:pPr>
-        <w:pStyle w:val="Normal"/>
-        <w:widowControl/>
-      </w:pPr>
-      <w:r>
-        <w:rPr>
-          <w:rFonts w:ascii="Calibri" w:hAnsi="Calibri" w:cs="Calibri"/>
-        </w:rPr>
-        <w:t>Version 1.3.0 does not claim:</w:t>
+        <w:t>legacy product-card implementations duplicated outside the canonical commercial family;</w:t>
       </w:r>
     </w:p>
     <w:p>
@@ -10284,7 +10535,44 @@
         <w:rPr>
           <w:rFonts w:ascii="Calibri" w:hAnsi="Calibri" w:cs="Calibri"/>
         </w:rPr>
-        <w:t>that the overall product is Baseline or production ready;</w:t>
+        <w:t>v1.2.2 phase descriptions that keep Phase 9 active or assign merchant editing outside P10C.</w:t>
+      </w:r>
+    </w:p>
+    <w:p>
+      <w:pPr>
+        <w:pStyle w:val="Normal"/>
+        <w:widowControl/>
+      </w:pPr>
+      <w:r>
+        <w:rPr>
+          <w:rFonts w:ascii="Calibri" w:hAnsi="Calibri" w:cs="Calibri"/>
+        </w:rPr>
+        <w:t>Migration must preserve canonical IDs, bindings, commerce truth, snapshot history, and published authority. An unresolved migration blocks compilation or rendering rather than silently dropping content or selecting a fallback variant. Legacy concrete commerce-route pages remain loadable, but convergence to root archetypes requires deterministic equality; materially different route presentations require an explicit typed migration decision.</w:t>
+      </w:r>
+    </w:p>
+    <w:p>
+      <w:pPr>
+        <w:pStyle w:val="Heading1"/>
+        <w:keepNext/>
+        <w:widowControl/>
+      </w:pPr>
+      <w:r>
+        <w:rPr>
+          <w:rFonts w:ascii="Calibri" w:hAnsi="Calibri" w:cs="Calibri"/>
+        </w:rPr>
+        <w:t>17. Explicit current non-claims</w:t>
+      </w:r>
+    </w:p>
+    <w:p>
+      <w:pPr>
+        <w:pStyle w:val="Normal"/>
+        <w:widowControl/>
+      </w:pPr>
+      <w:r>
+        <w:rPr>
+          <w:rFonts w:ascii="Calibri" w:hAnsi="Calibri" w:cs="Calibri"/>
+        </w:rPr>
+        <w:t>Version 1.3.0 does not claim:</w:t>
       </w:r>
     </w:p>
     <w:p>
@@ -10300,7 +10588,7 @@
         <w:rPr>
           <w:rFonts w:ascii="Calibri" w:hAnsi="Calibri" w:cs="Calibri"/>
         </w:rPr>
-        <w:t>that current output has passed the P10B commercial visual-quality gate;</w:t>
+        <w:t>that the overall product is Baseline or production ready;</w:t>
       </w:r>
     </w:p>
     <w:p>
@@ -10316,7 +10604,7 @@
         <w:rPr>
           <w:rFonts w:ascii="Calibri" w:hAnsi="Calibri" w:cs="Calibri"/>
         </w:rPr>
-        <w:t>that governed internal routing is wired into the normal merchant editor;</w:t>
+        <w:t>that current output has passed the P10B commercial visual-quality gate;</w:t>
       </w:r>
     </w:p>
     <w:p>
@@ -10332,7 +10620,7 @@
         <w:rPr>
           <w:rFonts w:ascii="Calibri" w:hAnsi="Calibri" w:cs="Calibri"/>
         </w:rPr>
-        <w:t>that the Vesko OpenAPI contract is sufficient for production integration;</w:t>
+        <w:t>that governed internal routing is wired into the normal merchant editor;</w:t>
       </w:r>
     </w:p>
     <w:p>
@@ -10348,21 +10636,7 @@
         <w:rPr>
           <w:rFonts w:ascii="Calibri" w:hAnsi="Calibri" w:cs="Calibri"/>
         </w:rPr>
-        <w:t xml:space="preserve">that raw Vesko Puck persistence is compatible with </w:t>
-      </w:r>
-      <w:r>
-        <w:rPr>
-          <w:rFonts w:ascii="Consolas" w:hAnsi="Consolas" w:cs="Consolas"/>
-          <w:sz w:val="19"/>
-          <w:szCs w:val="19"/>
-        </w:rPr>
-        <w:t>StorefrontSnapshot</w:t>
-      </w:r>
-      <w:r>
-        <w:rPr>
-          <w:rFonts w:ascii="Calibri" w:hAnsi="Calibri" w:cs="Calibri"/>
-        </w:rPr>
-        <w:t>;</w:t>
+        <w:t>that the Vesko OpenAPI contract is sufficient for production integration;</w:t>
       </w:r>
     </w:p>
     <w:p>
@@ -10378,7 +10652,21 @@
         <w:rPr>
           <w:rFonts w:ascii="Calibri" w:hAnsi="Calibri" w:cs="Calibri"/>
         </w:rPr>
-        <w:t>that Veskify may mutate commerce truth;</w:t>
+        <w:t xml:space="preserve">that raw Vesko Puck persistence is compatible with </w:t>
+      </w:r>
+      <w:r>
+        <w:rPr>
+          <w:rFonts w:ascii="Consolas" w:hAnsi="Consolas" w:cs="Consolas"/>
+          <w:sz w:val="19"/>
+          <w:szCs w:val="19"/>
+        </w:rPr>
+        <w:t>StorefrontSnapshot</w:t>
+      </w:r>
+      <w:r>
+        <w:rPr>
+          <w:rFonts w:ascii="Calibri" w:hAnsi="Calibri" w:cs="Calibri"/>
+        </w:rPr>
+        <w:t>;</w:t>
       </w:r>
     </w:p>
     <w:p>
@@ -10394,7 +10682,7 @@
         <w:rPr>
           <w:rFonts w:ascii="Calibri" w:hAnsi="Calibri" w:cs="Calibri"/>
         </w:rPr>
-        <w:t>that Vesko staging or production evidence exists;</w:t>
+        <w:t>that Veskify may mutate commerce truth;</w:t>
       </w:r>
     </w:p>
     <w:p>
@@ -10410,7 +10698,7 @@
         <w:rPr>
           <w:rFonts w:ascii="Calibri" w:hAnsi="Calibri" w:cs="Calibri"/>
         </w:rPr>
-        <w:t>that authentication, tenancy, observability, deployment, and operations are production complete;</w:t>
+        <w:t>that Vesko staging or production evidence exists;</w:t>
       </w:r>
     </w:p>
     <w:p>
@@ -10426,7 +10714,7 @@
         <w:rPr>
           <w:rFonts w:ascii="Calibri" w:hAnsi="Calibri" w:cs="Calibri"/>
         </w:rPr>
-        <w:t>that P10D advanced media is required for the first commercial storefront or pilot;</w:t>
+        <w:t>that authentication, tenancy, observability, deployment, and operations are production complete;</w:t>
       </w:r>
     </w:p>
     <w:p>
@@ -10442,7 +10730,7 @@
         <w:rPr>
           <w:rFonts w:ascii="Calibri" w:hAnsi="Calibri" w:cs="Calibri"/>
         </w:rPr>
-        <w:t>that the P10B-16P-02 prompted design-plan contract or P10B-16P-03 final Storefront Studio generation journey is implemented;</w:t>
+        <w:t>that P10D advanced media is required for the first commercial storefront or pilot;</w:t>
       </w:r>
     </w:p>
     <w:p>
@@ -10458,6 +10746,38 @@
         <w:rPr>
           <w:rFonts w:ascii="Calibri" w:hAnsi="Calibri" w:cs="Calibri"/>
         </w:rPr>
+        <w:t>that P10B-16P-02B deterministic intent compilation, P10B-16P-03 final Storefront Studio generation wiring, or P10B-16P-04 live V2 acceptance/legacy-bridge disposition is implemented;</w:t>
+      </w:r>
+    </w:p>
+    <w:p>
+      <w:pPr>
+        <w:pStyle w:val="Normal"/>
+        <w:numPr>
+          <w:ilvl w:val="0"/>
+          <w:numId w:val="1"/>
+        </w:numPr>
+        <w:widowControl/>
+      </w:pPr>
+      <w:r>
+        <w:rPr>
+          <w:rFonts w:ascii="Calibri" w:hAnsi="Calibri" w:cs="Calibri"/>
+        </w:rPr>
+        <w:t>that P10B-16P-02A materializes a storefront, creates a proposal or snapshot, provides executable search, or has live Design Intent V2 provider evidence;</w:t>
+      </w:r>
+    </w:p>
+    <w:p>
+      <w:pPr>
+        <w:pStyle w:val="Normal"/>
+        <w:numPr>
+          <w:ilvl w:val="0"/>
+          <w:numId w:val="1"/>
+        </w:numPr>
+        <w:widowControl/>
+      </w:pPr>
+      <w:r>
+        <w:rPr>
+          <w:rFonts w:ascii="Calibri" w:hAnsi="Calibri" w:cs="Calibri"/>
+        </w:rPr>
         <w:t>that archived v1.2.2 prose describes current implementation or phase status.</w:t>
       </w:r>
     </w:p>
@@ -10651,7 +10971,7 @@
         </w:rPr>
         <w:t xml:space="preserve"> identifiers are governed by the explicit exclusion in </w:t>
       </w:r>
-      <w:hyperlink r:id="rIdHyperlink25" w:history="1">
+      <w:hyperlink r:id="rIdHyperlink26" w:history="1">
         <w:r>
           <w:rPr>
             <w:rFonts w:ascii="Calibri" w:hAnsi="Calibri" w:cs="Calibri"/>

</xml_diff>

<commit_message>
fix: preserve exact prompted storefront authority
</commit_message>
<xml_diff>
--- a/docs/VESKIFY_SDD_v1.3.0.docx
+++ b/docs/VESKIFY_SDD_v1.3.0.docx
@@ -38,7 +38,7 @@
         <w:rPr>
           <w:rFonts w:ascii="Calibri" w:hAnsi="Calibri" w:cs="Calibri"/>
         </w:rPr>
-        <w:t>Verified baseline: 11 August 2026</w:t>
+        <w:t>Verified baseline: 12 August 2026</w:t>
       </w:r>
     </w:p>
     <w:p>
@@ -51,7 +51,7 @@
         <w:rPr>
           <w:rFonts w:ascii="Calibri" w:hAnsi="Calibri" w:cs="Calibri"/>
         </w:rPr>
-        <w:t>P10B-16P-02A prompted Storefront Design Intent V2 authority</w:t>
+        <w:t>P10B-16P-02B deterministic design-intent compilation and canonical proposal materialization</w:t>
       </w:r>
     </w:p>
     <w:p>
@@ -8812,7 +8812,7 @@
         <w:rPr>
           <w:rFonts w:ascii="Calibri" w:hAnsi="Calibri" w:cs="Calibri"/>
         </w:rPr>
-        <w:t xml:space="preserve">Only a successfully validated compiled decision may be consumed. It becomes one exact extension of the existing bounded synthesis decision and is then materialized once through the canonical P10B generation plan and isolated whole-storefront proposal lifecycle. </w:t>
+        <w:t xml:space="preserve">Only a successfully validated compiled decision may be consumed. It becomes one exact extension of the existing bounded synthesis decision and is then materialized once through the canonical P10B generation plan and isolated whole-storefront proposal lifecycle. This executable boundary carries the selected exact authority values, never a coordinated-direction </w:t>
       </w:r>
       <w:r>
         <w:rPr>
@@ -8820,13 +8820,13 @@
           <w:sz w:val="19"/>
           <w:szCs w:val="19"/>
         </w:rPr>
-        <w:t>PageBlueprint</w:t>
-      </w:r>
-      <w:r>
-        <w:rPr>
-          <w:rFonts w:ascii="Calibri" w:hAnsi="Calibri" w:cs="Calibri"/>
-        </w:rPr>
-        <w:t xml:space="preserve"> remains the composition authority and </w:t>
+        <w:t>selectionId</w:t>
+      </w:r>
+      <w:r>
+        <w:rPr>
+          <w:rFonts w:ascii="Calibri" w:hAnsi="Calibri" w:cs="Calibri"/>
+        </w:rPr>
+        <w:t xml:space="preserve">, compatibility-package wrapper or precomputed-candidate identity. Those identifiers may support bounded internal solving and diagnostics only. </w:t>
       </w:r>
       <w:r>
         <w:rPr>
@@ -8834,13 +8834,27 @@
           <w:sz w:val="19"/>
           <w:szCs w:val="19"/>
         </w:rPr>
+        <w:t>PageBlueprint</w:t>
+      </w:r>
+      <w:r>
+        <w:rPr>
+          <w:rFonts w:ascii="Calibri" w:hAnsi="Calibri" w:cs="Calibri"/>
+        </w:rPr>
+        <w:t xml:space="preserve"> remains the composition authority and </w:t>
+      </w:r>
+      <w:r>
+        <w:rPr>
+          <w:rFonts w:ascii="Consolas" w:hAnsi="Consolas" w:cs="Consolas"/>
+          <w:sz w:val="19"/>
+          <w:szCs w:val="19"/>
+        </w:rPr>
         <w:t>StorefrontSnapshot</w:t>
       </w:r>
       <w:r>
         <w:rPr>
           <w:rFonts w:ascii="Calibri" w:hAnsi="Calibri" w:cs="Calibri"/>
         </w:rPr>
-        <w:t xml:space="preserve"> remains the sole canonical editable state. Invalid, stale, incompatible, budget-exceeded, unsupported bounded-runtime, protected-commerce or partial results fail closed with no snapshot/proposal mutation. P10B-16P-02B made zero provider and Vesko calls and does not provide normal Storefront Studio wiring, executable search or live V2 acceptance.</w:t>
+        <w:t xml:space="preserve"> remains the sole canonical editable state. Invalid, stale, incompatible, budget-exceeded, unsupported bounded-runtime, protected-commerce or partial results fail closed with no snapshot/proposal mutation. Protected-commerce evidence verifies the actual materialized plan, proposal and proposed snapshot rather than trusting only compiler metadata. P10B-16P-02B made zero provider and Vesko calls and does not provide normal Storefront Studio wiring, executable search or live V2 acceptance.</w:t>
       </w:r>
     </w:p>
     <w:p>

</xml_diff>

<commit_message>
fix: preserve collection search compatibility
</commit_message>
<xml_diff>
--- a/docs/VESKIFY_SDD_v1.3.0.docx
+++ b/docs/VESKIFY_SDD_v1.3.0.docx
@@ -24360,7 +24360,19 @@
         <w:rPr>
           <w:rFonts w:ascii="Calibri" w:hAnsi="Calibri" w:cs="Calibri"/>
         </w:rPr>
-        <w:t>Editorial discovery remains curated and collection-only; campaign discovery still requires an approved purpose-affine asset; catalogue comparison uses standard fact-forward cards; dense collection/search uses horizontal high-scanability cards. Comparison and dense profiles are both truthfully executable in transient search-results context. Search renders explicit query/result/ filter/sort identity without synthetic collection claims through the same renderer and catalogue.</w:t>
+        <w:t>Editorial discovery remains curated and collection-only; campaign discovery still requires an approved purpose-affine asset; catalogue comparison uses standard fact-forward cards; dense collection/search uses horizontal high-scanability cards. Comparison and dense profiles are both truthfully executable in transient search-results context. Search renders explicit query/result/ filter/sort identity without synthetic collection claims through the same renderer and catalogue. Applied filter fields and canonical stock states render as localized EN/FI merchant labels. Medium/dense collection filters remain collapsible below 1024 px and become persistent only at the desktop breakpoint; comparison search omits the collection-only sidebar and spans the result grid.</w:t>
+      </w:r>
+    </w:p>
+    <w:p>
+      <w:pPr>
+        <w:pStyle w:val="Normal"/>
+        <w:widowControl/>
+      </w:pPr>
+      <w:r>
+        <w:rPr>
+          <w:rFonts w:ascii="Calibri" w:hAnsi="Calibri" w:cs="Calibri"/>
+        </w:rPr>
+        <w:t>Exact pre-P10B-18B-03 comparison/compact and dense-search/compact profile fingerprints have one deterministic compatibility migration to the current standard and horizontal anatomies. It increments the root authority revision/fingerprint while preserving routes, mappings, protected commerce, bounded presentation choices and approved assets. Unknown stale authorities remain fail-closed, while direct runtime projection keeps saved, historical and compiled snapshots renderable until the current authority is persisted.</w:t>
       </w:r>
     </w:p>
     <w:p>

</xml_diff>

<commit_message>
docs: synchronize structural family authority
</commit_message>
<xml_diff>
--- a/docs/VESKIFY_SDD_v1.3.0.docx
+++ b/docs/VESKIFY_SDD_v1.3.0.docx
@@ -38,7 +38,7 @@
         <w:rPr>
           <w:rFonts w:ascii="Calibri" w:hAnsi="Calibri" w:cs="Calibri"/>
         </w:rPr>
-        <w:t>Verified baseline: 19 August 2026</w:t>
+        <w:t>Verified baseline: 31 August 2026</w:t>
       </w:r>
     </w:p>
     <w:p>
@@ -51,7 +51,7 @@
         <w:rPr>
           <w:rFonts w:ascii="Calibri" w:hAnsi="Calibri" w:cs="Calibri"/>
         </w:rPr>
-        <w:t>Accepted P10B-18B-04 PDP quality upgrade</w:t>
+        <w:t>P10B-19A-01 structural family identity and lifecycle Baseline</w:t>
       </w:r>
     </w:p>
     <w:p>
@@ -284,7 +284,7 @@
               <w:rPr>
                 <w:rFonts w:ascii="Calibri" w:hAnsi="Calibri" w:cs="Calibri"/>
               </w:rPr>
-              <w:t>24 August 2026, P10B-18D diagnostic complete; live commercial quality rejected</w:t>
+              <w:t>31 August 2026, P10B-19A-01 structural family identity and lifecycle Baseline</w:t>
             </w:r>
           </w:p>
         </w:tc>
@@ -710,6 +710,85 @@
               <w:rPr>
                 <w:rFonts w:ascii="Calibri" w:hAnsi="Calibri" w:cs="Calibri"/>
               </w:rPr>
+              <w:t>1.3.0 P10B-19A-01</w:t>
+            </w:r>
+          </w:p>
+        </w:tc>
+        <w:tc>
+          <w:tcPr>
+            <w:tcW w:w="1500" w:type="dxa"/>
+            <w:vAlign w:val="center"/>
+          </w:tcPr>
+          <w:p>
+            <w:pPr>
+              <w:pStyle w:val="TableText"/>
+              <w:jc w:val="center"/>
+              <w:widowControl/>
+            </w:pPr>
+            <w:r>
+              <w:rPr>
+                <w:rFonts w:ascii="Calibri" w:hAnsi="Calibri" w:cs="Calibri"/>
+              </w:rPr>
+              <w:t>31 August 2026</w:t>
+            </w:r>
+          </w:p>
+        </w:tc>
+        <w:tc>
+          <w:tcPr>
+            <w:tcW w:w="2000" w:type="dxa"/>
+            <w:vAlign w:val="center"/>
+          </w:tcPr>
+          <w:p>
+            <w:pPr>
+              <w:pStyle w:val="TableText"/>
+              <w:widowControl/>
+            </w:pPr>
+            <w:r>
+              <w:rPr>
+                <w:rFonts w:ascii="Calibri" w:hAnsi="Calibri" w:cs="Calibri"/>
+              </w:rPr>
+              <w:t>P10B-19A-01 structural family identity and lifecycle baseline</w:t>
+            </w:r>
+          </w:p>
+        </w:tc>
+        <w:tc>
+          <w:tcPr>
+            <w:tcW w:w="4860" w:type="dxa"/>
+            <w:vAlign w:val="center"/>
+          </w:tcPr>
+          <w:p>
+            <w:pPr>
+              <w:pStyle w:val="TableText"/>
+              <w:widowControl/>
+            </w:pPr>
+            <w:r>
+              <w:rPr>
+                <w:rFonts w:ascii="Calibri" w:hAnsi="Calibri" w:cs="Calibri"/>
+              </w:rPr>
+              <w:t>Establish the exact six-family identity vocabulary, strict supported-major-v1 version and identity contract, deterministic duplicate rejection, candidate/active/deprecated lifecycle policy and active-only selectability without adding family records, a registry, selection, PageBlueprint v2, rendering or current-generation wiring; make P10B-19A-02 the exact next task.</w:t>
+            </w:r>
+          </w:p>
+        </w:tc>
+      </w:tr>
+      <w:tr>
+        <w:trPr>
+          <w:cantSplit/>
+        </w:trPr>
+        <w:tc>
+          <w:tcPr>
+            <w:tcW w:w="1000" w:type="dxa"/>
+            <w:vAlign w:val="center"/>
+          </w:tcPr>
+          <w:p>
+            <w:pPr>
+              <w:pStyle w:val="TableText"/>
+              <w:jc w:val="center"/>
+              <w:widowControl/>
+            </w:pPr>
+            <w:r>
+              <w:rPr>
+                <w:rFonts w:ascii="Calibri" w:hAnsi="Calibri" w:cs="Calibri"/>
+              </w:rPr>
               <w:t>1.3.0 P10B-18D</w:t>
             </w:r>
           </w:p>
@@ -4034,7 +4113,7 @@
         <w:rPr>
           <w:rFonts w:ascii="Calibri" w:hAnsi="Calibri" w:cs="Calibri"/>
         </w:rPr>
-        <w:t>: P10B-01 commercial grammar, P10B-02 parametric BrandSystem / Design DNA, P10B-03 component anatomy, P10B-04 responsive image/art-direction authority, P10B-05 site-map/page-family authority, P10B-06 commercial shared-frame families, P10B-07 hero/editorial/campaign/proof families, P10B-08 canonical product-card authority, P10B-09 commercial homepage profiles, and P10B-10 commercial collection/search profiles, P10B-11 commercial PDP profiles, P10B-12 content/support page families, P10B-13 commerce utility presentation, the P10B-14 Premium Editorial complete-storefront vertical slice, the P10B-15 bounded synthesis engine, P10B-16 direction/diversity authority, and P10B-16P-01 dynamic commerce route archetype authority, P10B-16P-02A prompted Design Intent V2 authority, P10B-16P-02B deterministic intent compilation/canonical proposal materialization, and P10B-16P-03 normal Studio prompted generation, P10B-16P-04 real-provider acceptance, P10B-16P-05A active-path/compiler rationalisation, P10B-16P-06 canonical search query/results authority, P10B-17 responsive/accessibility/performance closure, the accepted P10B-18A commercial-authority audit, accepted P10B-18B-01 Design DNA/shared-frame upgrade, accepted P10B-18B-06 asset-composition/art-direction upgrade, accepted P10B-18B-02 homepage/editorial/campaign quality upgrade, accepted P10B-18B-03 collection/search/product-card quality upgrade, accepted P10B-18B-04 PDP quality upgrade and accepted P10B-18B-05 content/support/utility quality upgrade are Baseline. P10B-16P-02 is Baseline; parent P10B-18B is Baseline/complete. P10B-18C and P10B-16P-05B are Baseline. P10B-18D is a Baseline diagnostic with live commercial quality rejected. P10B-18 and P10B remain Partial pending P10B-19. P10B-19 PRE is Baseline, and P10B-19A is the exact next task. The current merchant editor does not yet expose the governed routing and scoped editing authorities; that is intentionally P10C work, not a P10A closure requirement.</w:t>
+        <w:t>: P10B-01 commercial grammar, P10B-02 parametric BrandSystem / Design DNA, P10B-03 component anatomy, P10B-04 responsive image/art-direction authority, P10B-05 site-map/page-family authority, P10B-06 commercial shared-frame families, P10B-07 hero/editorial/campaign/proof families, P10B-08 canonical product-card authority, P10B-09 commercial homepage profiles, and P10B-10 commercial collection/search profiles, P10B-11 commercial PDP profiles, P10B-12 content/support page families, P10B-13 commerce utility presentation, the P10B-14 Premium Editorial complete-storefront vertical slice, the P10B-15 bounded synthesis engine, P10B-16 direction/diversity authority, and P10B-16P-01 dynamic commerce route archetype authority, P10B-16P-02A prompted Design Intent V2 authority, P10B-16P-02B deterministic intent compilation/canonical proposal materialization, and P10B-16P-03 normal Studio prompted generation, P10B-16P-04 real-provider acceptance, P10B-16P-05A active-path/compiler rationalisation, P10B-16P-06 canonical search query/results authority, P10B-17 responsive/accessibility/performance closure, the accepted P10B-18A commercial-authority audit, accepted P10B-18B-01 Design DNA/shared-frame upgrade, accepted P10B-18B-06 asset-composition/art-direction upgrade, accepted P10B-18B-02 homepage/editorial/campaign quality upgrade, accepted P10B-18B-03 collection/search/product-card quality upgrade, accepted P10B-18B-04 PDP quality upgrade and accepted P10B-18B-05 content/support/utility quality upgrade are Baseline. P10B-16P-02 is Baseline; parent P10B-18B is Baseline/complete. P10B-18C and P10B-16P-05B are Baseline. P10B-18D is a Baseline diagnostic with live commercial quality rejected. P10B-18 and P10B remain Partial pending P10B-19. P10B-19 PRE is Baseline. P10B-19A-01 is Baseline, parent P10B-19A is Partial, and P10B-19A-02 is the exact next task. The current merchant editor does not yet expose the governed routing and scoped editing authorities; that is intentionally P10C work, not a P10A closure requirement.</w:t>
       </w:r>
     </w:p>
     <w:p>
@@ -9579,7 +9658,7 @@
         <w:rPr>
           <w:rFonts w:ascii="Calibri" w:hAnsi="Calibri" w:cs="Calibri"/>
         </w:rPr>
-        <w:t>This establishes one representative complete store. P10B-15 generalizes that convergence path, P10B-16 governs direction/diversity authority, and P10B-16P-01 preserves the same route coverage while converging collection/search/PDP design into maintained root archetypes. P10B-16P-02A provides the strict transient prompted intent boundary, and P10B-16P-02B compiles its result into one exact canonical synthesis/proposal execution. P10B-16P-03 connects that authority to the normal Storefront Studio journey, and P10B-16P-04 adds accepted real V2 evidence plus bridge disposition. P10B-17 subsequently closes phase-wide responsive/accessibility/performance execution; accepted P10B-18A audits the prior ceiling; accepted P10B-18B-01 closes the bounded Design DNA/shared-frame upgrade; accepted P10B-18B-06 closes bounded asset-composition authority; accepted P10B-18B-02 closes bounded homepage/editorial/campaign quality; accepted P10B-18B-03 closes bounded collection/search/product-card quality; accepted P10B-18B-04 closes bounded PDP quality; and accepted P10B-18B-05 closes bounded content/support/utility quality. Parent P10B-18B is Baseline/complete; P10B-18C and P10B-16P-05B are Baseline. P10B-18D is a Baseline diagnostic with live commercial quality rejected. P10B-19 PRE is Baseline, and P10B-19A is the exact next task.</w:t>
+        <w:t>This establishes one representative complete store. P10B-15 generalizes that convergence path, P10B-16 governs direction/diversity authority, and P10B-16P-01 preserves the same route coverage while converging collection/search/PDP design into maintained root archetypes. P10B-16P-02A provides the strict transient prompted intent boundary, and P10B-16P-02B compiles its result into one exact canonical synthesis/proposal execution. P10B-16P-03 connects that authority to the normal Storefront Studio journey, and P10B-16P-04 adds accepted real V2 evidence plus bridge disposition. P10B-17 subsequently closes phase-wide responsive/accessibility/performance execution; accepted P10B-18A audits the prior ceiling; accepted P10B-18B-01 closes the bounded Design DNA/shared-frame upgrade; accepted P10B-18B-06 closes bounded asset-composition authority; accepted P10B-18B-02 closes bounded homepage/editorial/campaign quality; accepted P10B-18B-03 closes bounded collection/search/product-card quality; accepted P10B-18B-04 closes bounded PDP quality; and accepted P10B-18B-05 closes bounded content/support/utility quality. Parent P10B-18B is Baseline/complete; P10B-18C and P10B-16P-05B are Baseline. P10B-18D is a Baseline diagnostic with live commercial quality rejected. P10B-19 PRE is Baseline. P10B-19A-01 is Baseline, parent P10B-19A is Partial, and P10B-19A-02 is the exact next task.</w:t>
       </w:r>
     </w:p>
     <w:p>
@@ -10817,7 +10896,7 @@
         <w:rPr>
           <w:rFonts w:ascii="Calibri" w:hAnsi="Calibri" w:cs="Calibri"/>
         </w:rPr>
-        <w:t>P10B-16P-05A removes the active P10B-16L executable-intent route/provider/runtime and isolates P9/Lumo live generation as Deprecated historical, production-disabled evidence. Proven publication and migration fixtures remain where they have current consumers. The P10B-16P-04 Aurum acceptance composition remains production-disabled as the lean mock/live seam retained for P10B-18D. P10B-16P-05B is Baseline after its consumer-verified historical cleanup following accepted P10B-18C. P10B-16P-06 subsequently closes the standalone canonical search query/results adapter, P10B-17 closes responsive/accessibility/performance execution, and the accepted P10B-18A audit freezes the commercial-authority ceiling. Accepted P10B-18B-01 subsequently closes its Design DNA/shared-frame package, accepted P10B-18B-06 closes bounded asset-composition authority, accepted P10B-18B-02 closes bounded homepage/editorial/campaign quality; accepted P10B-18B-03 closes bounded collection/search/product-card quality; and accepted P10B-18B-04 closes bounded PDP quality; accepted P10B-18B-05 closes bounded content/support/utility quality. Parent P10B-18B is Baseline/complete; P10B-18C and P10B-16P-05B are Baseline. P10B-18D is a Baseline diagnostic with live commercial quality rejected. P10B-18 and P10B remain Partial. P10B-19 PRE is Baseline, and P10B-19A is the exact next task.</w:t>
+        <w:t>P10B-16P-05A removes the active P10B-16L executable-intent route/provider/runtime and isolates P9/Lumo live generation as Deprecated historical, production-disabled evidence. Proven publication and migration fixtures remain where they have current consumers. The P10B-16P-04 Aurum acceptance composition remains production-disabled as the lean mock/live seam retained for P10B-18D. P10B-16P-05B is Baseline after its consumer-verified historical cleanup following accepted P10B-18C. P10B-16P-06 subsequently closes the standalone canonical search query/results adapter, P10B-17 closes responsive/accessibility/performance execution, and the accepted P10B-18A audit freezes the commercial-authority ceiling. Accepted P10B-18B-01 subsequently closes its Design DNA/shared-frame package, accepted P10B-18B-06 closes bounded asset-composition authority, accepted P10B-18B-02 closes bounded homepage/editorial/campaign quality; accepted P10B-18B-03 closes bounded collection/search/product-card quality; and accepted P10B-18B-04 closes bounded PDP quality; accepted P10B-18B-05 closes bounded content/support/utility quality. Parent P10B-18B is Baseline/complete; P10B-18C and P10B-16P-05B are Baseline. P10B-18D is a Baseline diagnostic with live commercial quality rejected. P10B-18 and P10B remain Partial. P10B-19 PRE is Baseline. P10B-19A-01 is Baseline, parent P10B-19A is Partial, and P10B-19A-02 is the exact next task.</w:t>
       </w:r>
     </w:p>
     <w:p>
@@ -10976,7 +11055,7 @@
         <w:rPr>
           <w:rFonts w:ascii="Calibri" w:hAnsi="Calibri" w:cs="Calibri"/>
         </w:rPr>
-        <w:t>This Baseline uses the standalone catalogue adapter only and made zero provider or Vesko calls. It does not claim a Vesko search endpoint, AI/semantic/vector/fuzzy search, typo correction, recommendations, personalization, analytics, or operational commerce writes. P10B-17 subsequently closes the existing responsive/accessibility/performance authority. The accepted P10B-18A audit then freezes the commercial ceiling; accepted P10B-18B-01 closes its Design DNA/shared-frame package; accepted P10B-18B-06 closes bounded asset-composition authority; accepted P10B-18B-02 closes bounded homepage/editorial/campaign quality; accepted P10B-18B-03 closes bounded collection/search/product-card quality; accepted P10B-18B-04 closes bounded PDP quality; and accepted P10B-18B-05 closes bounded content/support/utility quality. Parent P10B-18B is Baseline/complete; P10B-18C and P10B-16P-05B are Baseline. P10B-18D is a Baseline diagnostic with live commercial quality rejected. P10B-18 and P10B remain Partial. P10B-19 PRE is Baseline, and P10B-19A is the exact next task.</w:t>
+        <w:t>This Baseline uses the standalone catalogue adapter only and made zero provider or Vesko calls. It does not claim a Vesko search endpoint, AI/semantic/vector/fuzzy search, typo correction, recommendations, personalization, analytics, or operational commerce writes. P10B-17 subsequently closes the existing responsive/accessibility/performance authority. The accepted P10B-18A audit then freezes the commercial ceiling; accepted P10B-18B-01 closes its Design DNA/shared-frame package; accepted P10B-18B-06 closes bounded asset-composition authority; accepted P10B-18B-02 closes bounded homepage/editorial/campaign quality; accepted P10B-18B-03 closes bounded collection/search/product-card quality; accepted P10B-18B-04 closes bounded PDP quality; and accepted P10B-18B-05 closes bounded content/support/utility quality. Parent P10B-18B is Baseline/complete; P10B-18C and P10B-16P-05B are Baseline. P10B-18D is a Baseline diagnostic with live commercial quality rejected. P10B-18 and P10B remain Partial. P10B-19 PRE is Baseline. P10B-19A-01 is Baseline, parent P10B-19A is Partial, and P10B-19A-02 is the exact next task.</w:t>
       </w:r>
     </w:p>
     <w:p>
@@ -11178,7 +11257,7 @@
         <w:rPr>
           <w:rFonts w:ascii="Calibri" w:hAnsi="Calibri" w:cs="Calibri"/>
         </w:rPr>
-        <w:t>, accepted on 22 August 2026 after the final 126-case and 280-capture quality/diversity gate. P10B-18D is a Baseline diagnostic with live commercial quality rejected. P10B-19 PRE is Baseline, and P10B-19A is the exact next task. Acceptance of P10B-18B-06 proves only its bounded asset selection, reuse, responsive source/crop, logo-consumer and art-direction authority. Acceptance of P10B-18B-02 proves only bounded homepage, editorial and campaign profile/renderer quality, not parent P10B-18B/P10B-18, later page families or complete-storefront designer-grade quality.</w:t>
+        <w:t>, accepted on 22 August 2026 after the final 126-case and 280-capture quality/diversity gate. P10B-18D is a Baseline diagnostic with live commercial quality rejected. P10B-19 PRE is Baseline. P10B-19A-01 is Baseline, parent P10B-19A is Partial, and P10B-19A-02 is the exact next task. Acceptance of P10B-18B-06 proves only its bounded asset selection, reuse, responsive source/crop, logo-consumer and art-direction authority. Acceptance of P10B-18B-02 proves only bounded homepage, editorial and campaign profile/renderer quality, not parent P10B-18B/P10B-18, later page families or complete-storefront designer-grade quality.</w:t>
       </w:r>
     </w:p>
     <w:p>
@@ -12672,7 +12751,7 @@
         <w:rPr>
           <w:rFonts w:ascii="Calibri" w:hAnsi="Calibri" w:cs="Calibri"/>
         </w:rPr>
-        <w:t xml:space="preserve"> P10B-01 through P10B-17, P10B-16P-01 through P10B-16P-05A, and P10B-16P-06 are Baseline; P10B-16P-02 is Baseline; accepted P10B-18A and P10B-18B-01/06/02/03/04/05 are Baseline; parent P10B-18B is Baseline/complete. P10B-18C and P10B-16P-05B are Baseline. P10B-18D is a Baseline diagnostic with live commercial quality rejected. P10B-18 and P10B remain Partial. P10B-19 PRE is Baseline, and P10B-19A is the exact next task. Deliver complete commercially credible storefronts with bounded material diversity through registered authority and retained human review.</w:t>
+        <w:t xml:space="preserve"> P10B-01 through P10B-17, P10B-16P-01 through P10B-16P-05A, and P10B-16P-06 are Baseline; P10B-16P-02 is Baseline; accepted P10B-18A and P10B-18B-01/06/02/03/04/05 are Baseline; parent P10B-18B is Baseline/complete. P10B-18C and P10B-16P-05B are Baseline. P10B-18D is a Baseline diagnostic with live commercial quality rejected. P10B-18 and P10B remain Partial. P10B-19 PRE is Baseline. P10B-19A-01 is Baseline, parent P10B-19A is Partial, and P10B-19A-02 is the exact next task. Deliver complete commercially credible storefronts with bounded material diversity through registered authority and retained human review.</w:t>
       </w:r>
     </w:p>
     <w:p>
@@ -24967,7 +25046,7 @@
         <w:rPr>
           <w:rFonts w:ascii="Calibri" w:hAnsi="Calibri" w:cs="Calibri"/>
         </w:rPr>
-        <w:t>. This adds no second snapshot, page graph, renderer, commerce model, provider path or production evaluation system. P10B-16P-05B subsequently completed the consumer-proven cleanup and is Baseline. P10B-18D live-AI commercial storefront diagnostic is complete with live commercial quality rejected. P10B-19 PRE is Baseline, and P10B-19A is the exact next task.</w:t>
+        <w:t>. This adds no second snapshot, page graph, renderer, commerce model, provider path or production evaluation system. P10B-16P-05B subsequently completed the consumer-proven cleanup and is Baseline. P10B-18D live-AI commercial storefront diagnostic is complete with live commercial quality rejected. P10B-19 PRE is Baseline. P10B-19A-01 is Baseline, parent P10B-19A is Partial, and P10B-19A-02 is the exact next task.</w:t>
       </w:r>
     </w:p>
     <w:p>
@@ -25016,7 +25095,7 @@
         <w:rPr>
           <w:rFonts w:ascii="Calibri" w:hAnsi="Calibri" w:cs="Calibri"/>
         </w:rPr>
-        <w:t>P10B remains Partial. P10B-18D is a Baseline diagnostic with live commercial quality rejected. The locked order is P10B-19 PRE Baseline, P10B-19A next, then P10B-19B through P10B-19J.</w:t>
+        <w:t>P10B remains Partial. P10B-18D is a Baseline diagnostic with live commercial quality rejected. The locked order is P10B-19 PRE Baseline, P10B-19A-01 Baseline, P10B-19A Partial, P10B-19A-02 next, then P10B-19A-03 through P10B-19A-10 and P10B-19B through P10B-19J.</w:t>
       </w:r>
     </w:p>
     <w:p>
@@ -25129,38 +25208,13 @@
           <w:sz w:val="19"/>
           <w:szCs w:val="19"/>
         </w:rPr>
-        <w:t>P10B-19A = Planned / exact next</w:t>
-      </w:r>
-      <w:r>
-        <w:rPr>
-          <w:rFonts w:ascii="Calibri" w:hAnsi="Calibri" w:cs="Calibri"/>
-        </w:rPr>
-        <w:t>; P10B-19B through P10B-19J remain Planned.</w:t>
-      </w:r>
-    </w:p>
-    <w:p>
-      <w:pPr>
-        <w:pStyle w:val="Heading1"/>
-        <w:keepNext/>
-        <w:widowControl/>
-      </w:pPr>
-      <w:r>
-        <w:rPr>
-          <w:rFonts w:ascii="Calibri" w:hAnsi="Calibri" w:cs="Calibri"/>
-        </w:rPr>
-        <w:t>P10B-19 structural design intelligence architecture baseline</w:t>
-      </w:r>
-    </w:p>
-    <w:p>
-      <w:pPr>
-        <w:pStyle w:val="Normal"/>
-        <w:widowControl/>
-      </w:pPr>
-      <w:r>
-        <w:rPr>
-          <w:rFonts w:ascii="Calibri" w:hAnsi="Calibri" w:cs="Calibri"/>
-        </w:rPr>
-        <w:t xml:space="preserve">P10B-19 PRE is Baseline following product-owner acceptance on 29 August 2026. The binding architecture is </w:t>
+        <w:t>P10B-19A-01 = Baseline</w:t>
+      </w:r>
+      <w:r>
+        <w:rPr>
+          <w:rFonts w:ascii="Calibri" w:hAnsi="Calibri" w:cs="Calibri"/>
+        </w:rPr>
+        <w:t xml:space="preserve">; </w:t>
       </w:r>
       <w:r>
         <w:rPr>
@@ -25168,6 +25222,59 @@
           <w:sz w:val="19"/>
           <w:szCs w:val="19"/>
         </w:rPr>
+        <w:t>P10B-19A = Partial</w:t>
+      </w:r>
+      <w:r>
+        <w:rPr>
+          <w:rFonts w:ascii="Calibri" w:hAnsi="Calibri" w:cs="Calibri"/>
+        </w:rPr>
+        <w:t xml:space="preserve">; </w:t>
+      </w:r>
+      <w:r>
+        <w:rPr>
+          <w:rFonts w:ascii="Consolas" w:hAnsi="Consolas" w:cs="Consolas"/>
+          <w:sz w:val="19"/>
+          <w:szCs w:val="19"/>
+        </w:rPr>
+        <w:t>P10B-19A-02 = Planned / exact next</w:t>
+      </w:r>
+      <w:r>
+        <w:rPr>
+          <w:rFonts w:ascii="Calibri" w:hAnsi="Calibri" w:cs="Calibri"/>
+        </w:rPr>
+        <w:t>; P10B-19A-03 through P10B-19A-10 and P10B-19B through P10B-19J remain Planned.</w:t>
+      </w:r>
+    </w:p>
+    <w:p>
+      <w:pPr>
+        <w:pStyle w:val="Heading1"/>
+        <w:keepNext/>
+        <w:widowControl/>
+      </w:pPr>
+      <w:r>
+        <w:rPr>
+          <w:rFonts w:ascii="Calibri" w:hAnsi="Calibri" w:cs="Calibri"/>
+        </w:rPr>
+        <w:t>P10B-19 structural design intelligence architecture baseline</w:t>
+      </w:r>
+    </w:p>
+    <w:p>
+      <w:pPr>
+        <w:pStyle w:val="Normal"/>
+        <w:widowControl/>
+      </w:pPr>
+      <w:r>
+        <w:rPr>
+          <w:rFonts w:ascii="Calibri" w:hAnsi="Calibri" w:cs="Calibri"/>
+        </w:rPr>
+        <w:t xml:space="preserve">P10B-19 PRE is Baseline following product-owner acceptance on 29 August 2026. The binding architecture is </w:t>
+      </w:r>
+      <w:r>
+        <w:rPr>
+          <w:rFonts w:ascii="Consolas" w:hAnsi="Consolas" w:cs="Consolas"/>
+          <w:sz w:val="19"/>
+          <w:szCs w:val="19"/>
+        </w:rPr>
         <w:t>docs/P10B_19_STRUCTURAL_DESIGN_INTELLIGENCE_ARCHITECTURE.md</w:t>
       </w:r>
       <w:r>
@@ -25404,7 +25511,448 @@
         <w:rPr>
           <w:rFonts w:ascii="Calibri" w:hAnsi="Calibri" w:cs="Calibri"/>
         </w:rPr>
-        <w:t>, one component registry, canonical Vesko commerce, exact approved media lineage, one deterministic compiler/coordinator, one final materializer/executor, proposal isolation, Accept/Reject, Undo/Redo, Save, reload, Preview, publication, and the Puck adapter boundary remain binding. P10B remains Partial. P10B-19A is the exact next task; P10B-19B through P10B-19J remain Planned.</w:t>
+        <w:t>, one component registry, canonical Vesko commerce, exact approved media lineage, one deterministic compiler/coordinator, one final materializer/executor, proposal isolation, Accept/Reject, Undo/Redo, Save, reload, Preview, publication, and the Puck adapter boundary remain binding. P10B remains Partial. P10B-19A-01 is Baseline, parent P10B-19A is Partial, and P10B-19A-02 is the exact next task; P10B-19A-03 through P10B-19A-10 and P10B-19B through P10B-19J remain Planned.</w:t>
+      </w:r>
+    </w:p>
+    <w:p>
+      <w:pPr>
+        <w:pStyle w:val="Heading2"/>
+        <w:keepNext/>
+        <w:widowControl/>
+      </w:pPr>
+      <w:r>
+        <w:rPr>
+          <w:rFonts w:ascii="Calibri" w:hAnsi="Calibri" w:cs="Calibri"/>
+        </w:rPr>
+        <w:t>10.31 P10B-19A-01 structural family identity and lifecycle authority</w:t>
+      </w:r>
+    </w:p>
+    <w:p>
+      <w:pPr>
+        <w:pStyle w:val="Normal"/>
+        <w:widowControl/>
+      </w:pPr>
+      <w:r>
+        <w:rPr>
+          <w:rFonts w:ascii="Calibri" w:hAnsi="Calibri" w:cs="Calibri"/>
+        </w:rPr>
+        <w:t xml:space="preserve">P10B-19A-01 establishes </w:t>
+      </w:r>
+      <w:r>
+        <w:rPr>
+          <w:rFonts w:ascii="Consolas" w:hAnsi="Consolas" w:cs="Consolas"/>
+          <w:sz w:val="19"/>
+          <w:szCs w:val="19"/>
+        </w:rPr>
+        <w:t>src/domain/structural-storefront-family</w:t>
+      </w:r>
+      <w:r>
+        <w:rPr>
+          <w:rFonts w:ascii="Calibri" w:hAnsi="Calibri" w:cs="Calibri"/>
+        </w:rPr>
+        <w:t xml:space="preserve"> as the sole Structural Storefront Family identity and lifecycle authority. The ordered, closed family-ID vocabulary is:</w:t>
+      </w:r>
+    </w:p>
+    <w:p>
+      <w:pPr>
+        <w:pStyle w:val="Normal"/>
+        <w:numPr>
+          <w:ilvl w:val="0"/>
+          <w:numId w:val="4"/>
+        </w:numPr>
+        <w:widowControl/>
+      </w:pPr>
+      <w:r>
+        <w:rPr>
+          <w:rFonts w:ascii="Consolas" w:hAnsi="Consolas" w:cs="Consolas"/>
+          <w:sz w:val="19"/>
+          <w:szCs w:val="19"/>
+        </w:rPr>
+        <w:t>editorial-offset</w:t>
+      </w:r>
+    </w:p>
+    <w:p>
+      <w:pPr>
+        <w:pStyle w:val="Normal"/>
+        <w:numPr>
+          <w:ilvl w:val="0"/>
+          <w:numId w:val="4"/>
+        </w:numPr>
+        <w:widowControl/>
+      </w:pPr>
+      <w:r>
+        <w:rPr>
+          <w:rFonts w:ascii="Consolas" w:hAnsi="Consolas" w:cs="Consolas"/>
+          <w:sz w:val="19"/>
+          <w:szCs w:val="19"/>
+        </w:rPr>
+        <w:t>campaign-modular</w:t>
+      </w:r>
+    </w:p>
+    <w:p>
+      <w:pPr>
+        <w:pStyle w:val="Normal"/>
+        <w:numPr>
+          <w:ilvl w:val="0"/>
+          <w:numId w:val="4"/>
+        </w:numPr>
+        <w:widowControl/>
+      </w:pPr>
+      <w:r>
+        <w:rPr>
+          <w:rFonts w:ascii="Consolas" w:hAnsi="Consolas" w:cs="Consolas"/>
+          <w:sz w:val="19"/>
+          <w:szCs w:val="19"/>
+        </w:rPr>
+        <w:t>product-first-commerce</w:t>
+      </w:r>
+    </w:p>
+    <w:p>
+      <w:pPr>
+        <w:pStyle w:val="Normal"/>
+        <w:numPr>
+          <w:ilvl w:val="0"/>
+          <w:numId w:val="4"/>
+        </w:numPr>
+        <w:widowControl/>
+      </w:pPr>
+      <w:r>
+        <w:rPr>
+          <w:rFonts w:ascii="Consolas" w:hAnsi="Consolas" w:cs="Consolas"/>
+          <w:sz w:val="19"/>
+          <w:szCs w:val="19"/>
+        </w:rPr>
+        <w:t>technical-comparison</w:t>
+      </w:r>
+    </w:p>
+    <w:p>
+      <w:pPr>
+        <w:pStyle w:val="Normal"/>
+        <w:numPr>
+          <w:ilvl w:val="0"/>
+          <w:numId w:val="4"/>
+        </w:numPr>
+        <w:widowControl/>
+      </w:pPr>
+      <w:r>
+        <w:rPr>
+          <w:rFonts w:ascii="Consolas" w:hAnsi="Consolas" w:cs="Consolas"/>
+          <w:sz w:val="19"/>
+          <w:szCs w:val="19"/>
+        </w:rPr>
+        <w:t>warm-narrative</w:t>
+      </w:r>
+    </w:p>
+    <w:p>
+      <w:pPr>
+        <w:pStyle w:val="Normal"/>
+        <w:numPr>
+          <w:ilvl w:val="0"/>
+          <w:numId w:val="4"/>
+        </w:numPr>
+        <w:widowControl/>
+      </w:pPr>
+      <w:r>
+        <w:rPr>
+          <w:rFonts w:ascii="Consolas" w:hAnsi="Consolas" w:cs="Consolas"/>
+          <w:sz w:val="19"/>
+          <w:szCs w:val="19"/>
+        </w:rPr>
+        <w:t>restrained-gallery</w:t>
+      </w:r>
+    </w:p>
+    <w:p>
+      <w:pPr>
+        <w:pStyle w:val="Normal"/>
+        <w:widowControl/>
+      </w:pPr>
+      <w:r>
+        <w:rPr>
+          <w:rFonts w:ascii="Calibri" w:hAnsi="Calibri" w:cs="Calibri"/>
+        </w:rPr>
+        <w:t xml:space="preserve">The family contract schema version and initial family record version are independently named and both begin at </w:t>
+      </w:r>
+      <w:r>
+        <w:rPr>
+          <w:rFonts w:ascii="Consolas" w:hAnsi="Consolas" w:cs="Consolas"/>
+          <w:sz w:val="19"/>
+          <w:szCs w:val="19"/>
+        </w:rPr>
+        <w:t>1.0.0</w:t>
+      </w:r>
+      <w:r>
+        <w:rPr>
+          <w:rFonts w:ascii="Calibri" w:hAnsi="Calibri" w:cs="Calibri"/>
+        </w:rPr>
+        <w:t xml:space="preserve">. Family record versions accept only canonical </w:t>
+      </w:r>
+      <w:r>
+        <w:rPr>
+          <w:rFonts w:ascii="Consolas" w:hAnsi="Consolas" w:cs="Consolas"/>
+          <w:sz w:val="19"/>
+          <w:szCs w:val="19"/>
+        </w:rPr>
+        <w:t>major.minor.patch</w:t>
+      </w:r>
+      <w:r>
+        <w:rPr>
+          <w:rFonts w:ascii="Calibri" w:hAnsi="Calibri" w:cs="Calibri"/>
+        </w:rPr>
+        <w:t xml:space="preserve"> values for supported major </w:t>
+      </w:r>
+      <w:r>
+        <w:rPr>
+          <w:rFonts w:ascii="Consolas" w:hAnsi="Consolas" w:cs="Consolas"/>
+          <w:sz w:val="19"/>
+          <w:szCs w:val="19"/>
+        </w:rPr>
+        <w:t>1</w:t>
+      </w:r>
+      <w:r>
+        <w:rPr>
+          <w:rFonts w:ascii="Calibri" w:hAnsi="Calibri" w:cs="Calibri"/>
+        </w:rPr>
+        <w:t xml:space="preserve">; prefixes, suffixes, prerelease/build metadata, whitespace, leading zeroes and unsupported major versions fail closed. A family identity contains exactly </w:t>
+      </w:r>
+      <w:r>
+        <w:rPr>
+          <w:rFonts w:ascii="Consolas" w:hAnsi="Consolas" w:cs="Consolas"/>
+          <w:sz w:val="19"/>
+          <w:szCs w:val="19"/>
+        </w:rPr>
+        <w:t>familyId</w:t>
+      </w:r>
+      <w:r>
+        <w:rPr>
+          <w:rFonts w:ascii="Calibri" w:hAnsi="Calibri" w:cs="Calibri"/>
+        </w:rPr>
+        <w:t xml:space="preserve"> and </w:t>
+      </w:r>
+      <w:r>
+        <w:rPr>
+          <w:rFonts w:ascii="Consolas" w:hAnsi="Consolas" w:cs="Consolas"/>
+          <w:sz w:val="19"/>
+          <w:szCs w:val="19"/>
+        </w:rPr>
+        <w:t>familyVersion</w:t>
+      </w:r>
+      <w:r>
+        <w:rPr>
+          <w:rFonts w:ascii="Calibri" w:hAnsi="Calibri" w:cs="Calibri"/>
+        </w:rPr>
+        <w:t xml:space="preserve">, and its deterministic identity key is </w:t>
+      </w:r>
+      <w:r>
+        <w:rPr>
+          <w:rFonts w:ascii="Consolas" w:hAnsi="Consolas" w:cs="Consolas"/>
+          <w:sz w:val="19"/>
+          <w:szCs w:val="19"/>
+        </w:rPr>
+        <w:t>&lt;familyId&gt;@&lt;familyVersion&gt;</w:t>
+      </w:r>
+      <w:r>
+        <w:rPr>
+          <w:rFonts w:ascii="Calibri" w:hAnsi="Calibri" w:cs="Calibri"/>
+        </w:rPr>
+        <w:t>. Duplicate instances of the same exact identity reject with bounded, sorted evidence; the same family ID at a different supported version and different family IDs at one version remain distinct identities.</w:t>
+      </w:r>
+    </w:p>
+    <w:p>
+      <w:pPr>
+        <w:pStyle w:val="Normal"/>
+        <w:widowControl/>
+      </w:pPr>
+      <w:r>
+        <w:rPr>
+          <w:rFonts w:ascii="Calibri" w:hAnsi="Calibri" w:cs="Calibri"/>
+        </w:rPr>
+        <w:t xml:space="preserve">The lifecycle vocabulary is exactly </w:t>
+      </w:r>
+      <w:r>
+        <w:rPr>
+          <w:rFonts w:ascii="Consolas" w:hAnsi="Consolas" w:cs="Consolas"/>
+          <w:sz w:val="19"/>
+          <w:szCs w:val="19"/>
+        </w:rPr>
+        <w:t>candidate</w:t>
+      </w:r>
+      <w:r>
+        <w:rPr>
+          <w:rFonts w:ascii="Calibri" w:hAnsi="Calibri" w:cs="Calibri"/>
+        </w:rPr>
+        <w:t xml:space="preserve">, </w:t>
+      </w:r>
+      <w:r>
+        <w:rPr>
+          <w:rFonts w:ascii="Consolas" w:hAnsi="Consolas" w:cs="Consolas"/>
+          <w:sz w:val="19"/>
+          <w:szCs w:val="19"/>
+        </w:rPr>
+        <w:t>active</w:t>
+      </w:r>
+      <w:r>
+        <w:rPr>
+          <w:rFonts w:ascii="Calibri" w:hAnsi="Calibri" w:cs="Calibri"/>
+        </w:rPr>
+        <w:t xml:space="preserve"> and </w:t>
+      </w:r>
+      <w:r>
+        <w:rPr>
+          <w:rFonts w:ascii="Consolas" w:hAnsi="Consolas" w:cs="Consolas"/>
+          <w:sz w:val="19"/>
+          <w:szCs w:val="19"/>
+        </w:rPr>
+        <w:t>deprecated</w:t>
+      </w:r>
+      <w:r>
+        <w:rPr>
+          <w:rFonts w:ascii="Calibri" w:hAnsi="Calibri" w:cs="Calibri"/>
+        </w:rPr>
+        <w:t xml:space="preserve">, with </w:t>
+      </w:r>
+      <w:r>
+        <w:rPr>
+          <w:rFonts w:ascii="Consolas" w:hAnsi="Consolas" w:cs="Consolas"/>
+          <w:sz w:val="19"/>
+          <w:szCs w:val="19"/>
+        </w:rPr>
+        <w:t>candidate</w:t>
+      </w:r>
+      <w:r>
+        <w:rPr>
+          <w:rFonts w:ascii="Calibri" w:hAnsi="Calibri" w:cs="Calibri"/>
+        </w:rPr>
+        <w:t xml:space="preserve"> as the initial state. The only legal forward transitions are </w:t>
+      </w:r>
+      <w:r>
+        <w:rPr>
+          <w:rFonts w:ascii="Consolas" w:hAnsi="Consolas" w:cs="Consolas"/>
+          <w:sz w:val="19"/>
+          <w:szCs w:val="19"/>
+        </w:rPr>
+        <w:t>candidate -&gt; active</w:t>
+      </w:r>
+      <w:r>
+        <w:rPr>
+          <w:rFonts w:ascii="Calibri" w:hAnsi="Calibri" w:cs="Calibri"/>
+        </w:rPr>
+        <w:t xml:space="preserve">, </w:t>
+      </w:r>
+      <w:r>
+        <w:rPr>
+          <w:rFonts w:ascii="Consolas" w:hAnsi="Consolas" w:cs="Consolas"/>
+          <w:sz w:val="19"/>
+          <w:szCs w:val="19"/>
+        </w:rPr>
+        <w:t>candidate -&gt; deprecated</w:t>
+      </w:r>
+      <w:r>
+        <w:rPr>
+          <w:rFonts w:ascii="Calibri" w:hAnsi="Calibri" w:cs="Calibri"/>
+        </w:rPr>
+        <w:t xml:space="preserve"> and </w:t>
+      </w:r>
+      <w:r>
+        <w:rPr>
+          <w:rFonts w:ascii="Consolas" w:hAnsi="Consolas" w:cs="Consolas"/>
+          <w:sz w:val="19"/>
+          <w:szCs w:val="19"/>
+        </w:rPr>
+        <w:t>active -&gt; deprecated</w:t>
+      </w:r>
+      <w:r>
+        <w:rPr>
+          <w:rFonts w:ascii="Calibri" w:hAnsi="Calibri" w:cs="Calibri"/>
+        </w:rPr>
+        <w:t xml:space="preserve">. Candidate activation records the requirement for future governed activation authority; this child does not implement that authority. Reverse, self, unknown and identity-changing transitions fail closed. Only </w:t>
+      </w:r>
+      <w:r>
+        <w:rPr>
+          <w:rFonts w:ascii="Consolas" w:hAnsi="Consolas" w:cs="Consolas"/>
+          <w:sz w:val="19"/>
+          <w:szCs w:val="19"/>
+        </w:rPr>
+        <w:t>active</w:t>
+      </w:r>
+      <w:r>
+        <w:rPr>
+          <w:rFonts w:ascii="Calibri" w:hAnsi="Calibri" w:cs="Calibri"/>
+        </w:rPr>
+        <w:t xml:space="preserve"> is selectable.</w:t>
+      </w:r>
+    </w:p>
+    <w:p>
+      <w:pPr>
+        <w:pStyle w:val="Normal"/>
+        <w:widowControl/>
+      </w:pPr>
+      <w:r>
+        <w:rPr>
+          <w:rFonts w:ascii="Calibri" w:hAnsi="Calibri" w:cs="Calibri"/>
+        </w:rPr>
+        <w:t>Active family-record count and candidate registry-record count both remain zero. This child adds no family registry, family records, candidate records, fingerprints, selector wiring, PageBlueprint v2, rendering, migration, provider payload or current-generation consumption. Existing v1 generation, snapshots, protected commerce/media, proposal lifecycle, editor, preview, publication and merchant-visible output remain unchanged.</w:t>
+      </w:r>
+    </w:p>
+    <w:p>
+      <w:pPr>
+        <w:pStyle w:val="Normal"/>
+        <w:widowControl/>
+      </w:pPr>
+      <w:r>
+        <w:rPr>
+          <w:rFonts w:ascii="Consolas" w:hAnsi="Consolas" w:cs="Consolas"/>
+          <w:sz w:val="19"/>
+          <w:szCs w:val="19"/>
+        </w:rPr>
+        <w:t>P10B-19A-01 = Baseline</w:t>
+      </w:r>
+      <w:r>
+        <w:rPr>
+          <w:rFonts w:ascii="Calibri" w:hAnsi="Calibri" w:cs="Calibri"/>
+        </w:rPr>
+        <w:t xml:space="preserve">; </w:t>
+      </w:r>
+      <w:r>
+        <w:rPr>
+          <w:rFonts w:ascii="Consolas" w:hAnsi="Consolas" w:cs="Consolas"/>
+          <w:sz w:val="19"/>
+          <w:szCs w:val="19"/>
+        </w:rPr>
+        <w:t>P10B-19A = Partial</w:t>
+      </w:r>
+      <w:r>
+        <w:rPr>
+          <w:rFonts w:ascii="Calibri" w:hAnsi="Calibri" w:cs="Calibri"/>
+        </w:rPr>
+        <w:t xml:space="preserve">; </w:t>
+      </w:r>
+      <w:r>
+        <w:rPr>
+          <w:rFonts w:ascii="Consolas" w:hAnsi="Consolas" w:cs="Consolas"/>
+          <w:sz w:val="19"/>
+          <w:szCs w:val="19"/>
+        </w:rPr>
+        <w:t>P10B-19A-02 = Planned / exact next</w:t>
+      </w:r>
+      <w:r>
+        <w:rPr>
+          <w:rFonts w:ascii="Calibri" w:hAnsi="Calibri" w:cs="Calibri"/>
+        </w:rPr>
+        <w:t xml:space="preserve">; </w:t>
+      </w:r>
+      <w:r>
+        <w:rPr>
+          <w:rFonts w:ascii="Consolas" w:hAnsi="Consolas" w:cs="Consolas"/>
+          <w:sz w:val="19"/>
+          <w:szCs w:val="19"/>
+        </w:rPr>
+        <w:t>P10B = Partial</w:t>
+      </w:r>
+      <w:r>
+        <w:rPr>
+          <w:rFonts w:ascii="Calibri" w:hAnsi="Calibri" w:cs="Calibri"/>
+        </w:rPr>
+        <w:t>.</w:t>
       </w:r>
     </w:p>
     <w:sectPr>

</xml_diff>

<commit_message>
test: lock positive cross-authority integration
</commit_message>
<xml_diff>
--- a/docs/VESKIFY_SDD_v1.3.0.docx
+++ b/docs/VESKIFY_SDD_v1.3.0.docx
@@ -38,7 +38,7 @@
         <w:rPr>
           <w:rFonts w:ascii="Calibri" w:hAnsi="Calibri" w:cs="Calibri"/>
         </w:rPr>
-        <w:t>Verified baseline: 3 September 2026</w:t>
+        <w:t>Verified baseline: 4 September 2026</w:t>
       </w:r>
     </w:p>
     <w:p>
@@ -51,7 +51,7 @@
         <w:rPr>
           <w:rFonts w:ascii="Calibri" w:hAnsi="Calibri" w:cs="Calibri"/>
         </w:rPr>
-        <w:t>P10B-19A-10A Retained Matrix Inventory and Frozen Baseline Lock</w:t>
+        <w:t>P10B-19A-10B1 Positive Cross-Authority Integration Matrix</w:t>
       </w:r>
     </w:p>
     <w:p>
@@ -284,7 +284,7 @@
               <w:rPr>
                 <w:rFonts w:ascii="Calibri" w:hAnsi="Calibri" w:cs="Calibri"/>
               </w:rPr>
-              <w:t>3 September 2026, P10B-19A-10A Retained Matrix Inventory and Frozen Baseline Lock</w:t>
+              <w:t>4 September 2026, P10B-19A-10B1 Positive Cross-Authority Integration Matrix</w:t>
             </w:r>
           </w:p>
         </w:tc>
@@ -710,6 +710,85 @@
               <w:rPr>
                 <w:rFonts w:ascii="Calibri" w:hAnsi="Calibri" w:cs="Calibri"/>
               </w:rPr>
+              <w:t>1.3.0 P10B-19A-10B1</w:t>
+            </w:r>
+          </w:p>
+        </w:tc>
+        <w:tc>
+          <w:tcPr>
+            <w:tcW w:w="1500" w:type="dxa"/>
+            <w:vAlign w:val="center"/>
+          </w:tcPr>
+          <w:p>
+            <w:pPr>
+              <w:pStyle w:val="TableText"/>
+              <w:jc w:val="center"/>
+              <w:widowControl/>
+            </w:pPr>
+            <w:r>
+              <w:rPr>
+                <w:rFonts w:ascii="Calibri" w:hAnsi="Calibri" w:cs="Calibri"/>
+              </w:rPr>
+              <w:t>4 September 2026</w:t>
+            </w:r>
+          </w:p>
+        </w:tc>
+        <w:tc>
+          <w:tcPr>
+            <w:tcW w:w="2000" w:type="dxa"/>
+            <w:vAlign w:val="center"/>
+          </w:tcPr>
+          <w:p>
+            <w:pPr>
+              <w:pStyle w:val="TableText"/>
+              <w:widowControl/>
+            </w:pPr>
+            <w:r>
+              <w:rPr>
+                <w:rFonts w:ascii="Calibri" w:hAnsi="Calibri" w:cs="Calibri"/>
+              </w:rPr>
+              <w:t>P10B-19A-10B1 Positive Cross-Authority Integration Matrix</w:t>
+            </w:r>
+          </w:p>
+        </w:tc>
+        <w:tc>
+          <w:tcPr>
+            <w:tcW w:w="4860" w:type="dxa"/>
+            <w:vAlign w:val="center"/>
+          </w:tcPr>
+          <w:p>
+            <w:pPr>
+              <w:pStyle w:val="TableText"/>
+              <w:widowControl/>
+            </w:pPr>
+            <w:r>
+              <w:rPr>
+                <w:rFonts w:ascii="Calibri" w:hAnsi="Calibri" w:cs="Calibri"/>
+              </w:rPr>
+              <w:t>Delivery-decompose A-10B into A-10B1 positive integration and A-10B2 fail-closed failure/parent closure without changing the accepted 73-child architecture; freeze the positive 8/6/6/3 authority with three two-identity topology groups, six direct receipts and three sequential topology-distinct receipts; preserve A-09 and byte-identical A-10A 24/76/9 authority, accepted 126/72 metrics and zero production/runtime reach; leave A-10B, A-10 and P10B-19A Partial and make A-10B2 exact next.</w:t>
+            </w:r>
+          </w:p>
+        </w:tc>
+      </w:tr>
+      <w:tr>
+        <w:trPr>
+          <w:cantSplit/>
+        </w:trPr>
+        <w:tc>
+          <w:tcPr>
+            <w:tcW w:w="1000" w:type="dxa"/>
+            <w:vAlign w:val="center"/>
+          </w:tcPr>
+          <w:p>
+            <w:pPr>
+              <w:pStyle w:val="TableText"/>
+              <w:jc w:val="center"/>
+              <w:widowControl/>
+            </w:pPr>
+            <w:r>
+              <w:rPr>
+                <w:rFonts w:ascii="Calibri" w:hAnsi="Calibri" w:cs="Calibri"/>
+              </w:rPr>
               <w:t>1.3.0 P10B-19A-10A</w:t>
             </w:r>
           </w:p>
@@ -5420,7 +5499,7 @@
         <w:rPr>
           <w:rFonts w:ascii="Calibri" w:hAnsi="Calibri" w:cs="Calibri"/>
         </w:rPr>
-        <w:t>: P10B-01 commercial grammar, P10B-02 parametric BrandSystem / Design DNA, P10B-03 component anatomy, P10B-04 responsive image/art-direction authority, P10B-05 site-map/page-family authority, P10B-06 commercial shared-frame families, P10B-07 hero/editorial/campaign/proof families, P10B-08 canonical product-card authority, P10B-09 commercial homepage profiles, and P10B-10 commercial collection/search profiles, P10B-11 commercial PDP profiles, P10B-12 content/support page families, P10B-13 commerce utility presentation, the P10B-14 Premium Editorial complete-storefront vertical slice, the P10B-15 bounded synthesis engine, P10B-16 direction/diversity authority, and P10B-16P-01 dynamic commerce route archetype authority, P10B-16P-02A prompted Design Intent V2 authority, P10B-16P-02B deterministic intent compilation/canonical proposal materialization, and P10B-16P-03 normal Studio prompted generation, P10B-16P-04 real-provider acceptance, P10B-16P-05A active-path/compiler rationalisation, P10B-16P-06 canonical search query/results authority, P10B-17 responsive/accessibility/performance closure, the accepted P10B-18A commercial-authority audit, accepted P10B-18B-01 Design DNA/shared-frame upgrade, accepted P10B-18B-06 asset-composition/art-direction upgrade, accepted P10B-18B-02 homepage/editorial/campaign quality upgrade, accepted P10B-18B-03 collection/search/product-card quality upgrade, accepted P10B-18B-04 PDP quality upgrade and accepted P10B-18B-05 content/support/utility quality upgrade are Baseline. P10B-16P-02 is Baseline; parent P10B-18B is Baseline/complete. P10B-18C and P10B-16P-05B are Baseline. P10B-18D is a Baseline diagnostic with live commercial quality rejected. P10B-18 and P10B remain Partial pending P10B-19. P10B-19 PRE is Baseline. P10B-19A-01 through P10B-19A-08C are Baseline; parent P10B-19A-08 is Baseline / closed. P10B-19A-09A, P10B-19A-09B, P10B-19A-09C and P10B-19A-10A are Baseline; parent P10B-19A-09 is Baseline / closed. Parent P10B-19A-10 and P10B-19A remain Partial; P10B-19A-10B is the exact next implementation task, P10B-19A-10C is Planned after A-10B, and P10B-19B-01 is Planned after A-10C. The current merchant editor does not yet expose the governed routing and scoped editing authorities; that is intentionally P10C work, not a P10A closure requirement.</w:t>
+        <w:t>: P10B-01 commercial grammar, P10B-02 parametric BrandSystem / Design DNA, P10B-03 component anatomy, P10B-04 responsive image/art-direction authority, P10B-05 site-map/page-family authority, P10B-06 commercial shared-frame families, P10B-07 hero/editorial/campaign/proof families, P10B-08 canonical product-card authority, P10B-09 commercial homepage profiles, and P10B-10 commercial collection/search profiles, P10B-11 commercial PDP profiles, P10B-12 content/support page families, P10B-13 commerce utility presentation, the P10B-14 Premium Editorial complete-storefront vertical slice, the P10B-15 bounded synthesis engine, P10B-16 direction/diversity authority, and P10B-16P-01 dynamic commerce route archetype authority, P10B-16P-02A prompted Design Intent V2 authority, P10B-16P-02B deterministic intent compilation/canonical proposal materialization, and P10B-16P-03 normal Studio prompted generation, P10B-16P-04 real-provider acceptance, P10B-16P-05A active-path/compiler rationalisation, P10B-16P-06 canonical search query/results authority, P10B-17 responsive/accessibility/performance closure, the accepted P10B-18A commercial-authority audit, accepted P10B-18B-01 Design DNA/shared-frame upgrade, accepted P10B-18B-06 asset-composition/art-direction upgrade, accepted P10B-18B-02 homepage/editorial/campaign quality upgrade, accepted P10B-18B-03 collection/search/product-card quality upgrade, accepted P10B-18B-04 PDP quality upgrade and accepted P10B-18B-05 content/support/utility quality upgrade are Baseline. P10B-16P-02 is Baseline; parent P10B-18B is Baseline/complete. P10B-18C and P10B-16P-05B are Baseline. P10B-18D is a Baseline diagnostic with live commercial quality rejected. P10B-18 and P10B remain Partial pending P10B-19. P10B-19 PRE is Baseline. P10B-19A-01 through P10B-19A-08C are Baseline; parent P10B-19A-08 is Baseline / closed. P10B-19A-09A, P10B-19A-09B, P10B-19A-09C, P10B-19A-10A and P10B-19A-10B1 are Baseline; parent P10B-19A-09 is Baseline / closed. Parent P10B-19A-10B, P10B-19A-10 and P10B-19A remain Partial; P10B-19A-10B2 is the exact next implementation task, P10B-19A-10C is Planned after A-10B2, and P10B-19B-01 is Planned after A-10C. The current merchant editor does not yet expose the governed routing and scoped editing authorities; that is intentionally P10C work, not a P10A closure requirement.</w:t>
       </w:r>
     </w:p>
     <w:p>
@@ -11009,7 +11088,7 @@
         <w:rPr>
           <w:rFonts w:ascii="Calibri" w:hAnsi="Calibri" w:cs="Calibri"/>
         </w:rPr>
-        <w:t>This establishes one representative complete store. P10B-15 generalizes that convergence path, P10B-16 governs direction/diversity authority, and P10B-16P-01 preserves the same route coverage while converging collection/search/PDP design into maintained root archetypes. P10B-16P-02A provides the strict transient prompted intent boundary, and P10B-16P-02B compiles its result into one exact canonical synthesis/proposal execution. P10B-16P-03 connects that authority to the normal Storefront Studio journey, and P10B-16P-04 adds accepted real V2 evidence plus bridge disposition. P10B-17 subsequently closes phase-wide responsive/accessibility/performance execution; accepted P10B-18A audits the prior ceiling; accepted P10B-18B-01 closes the bounded Design DNA/shared-frame upgrade; accepted P10B-18B-06 closes bounded asset-composition authority; accepted P10B-18B-02 closes bounded homepage/editorial/campaign quality; accepted P10B-18B-03 closes bounded collection/search/product-card quality; accepted P10B-18B-04 closes bounded PDP quality; and accepted P10B-18B-05 closes bounded content/support/utility quality. Parent P10B-18B is Baseline/complete; P10B-18C and P10B-16P-05B are Baseline. P10B-18D is a Baseline diagnostic with live commercial quality rejected. P10B-19 PRE is Baseline. P10B-19A-01 through P10B-19A-08C are Baseline; parent P10B-19A-08 is Baseline / closed. P10B-19A-09A, P10B-19A-09B and P10B-19A-09C and P10B-19A-10A are Baseline; parent P10B-19A-09 is Baseline / closed. Parent P10B-19A-10 and P10B-19A remain Partial, and P10B-19A-10B is the exact next implementation task.</w:t>
+        <w:t>This establishes one representative complete store. P10B-15 generalizes that convergence path, P10B-16 governs direction/diversity authority, and P10B-16P-01 preserves the same route coverage while converging collection/search/PDP design into maintained root archetypes. P10B-16P-02A provides the strict transient prompted intent boundary, and P10B-16P-02B compiles its result into one exact canonical synthesis/proposal execution. P10B-16P-03 connects that authority to the normal Storefront Studio journey, and P10B-16P-04 adds accepted real V2 evidence plus bridge disposition. P10B-17 subsequently closes phase-wide responsive/accessibility/performance execution; accepted P10B-18A audits the prior ceiling; accepted P10B-18B-01 closes the bounded Design DNA/shared-frame upgrade; accepted P10B-18B-06 closes bounded asset-composition authority; accepted P10B-18B-02 closes bounded homepage/editorial/campaign quality; accepted P10B-18B-03 closes bounded collection/search/product-card quality; accepted P10B-18B-04 closes bounded PDP quality; and accepted P10B-18B-05 closes bounded content/support/utility quality. Parent P10B-18B is Baseline/complete; P10B-18C and P10B-16P-05B are Baseline. P10B-18D is a Baseline diagnostic with live commercial quality rejected. P10B-19 PRE is Baseline. P10B-19A-01 through P10B-19A-08C are Baseline; parent P10B-19A-08 is Baseline / closed. P10B-19A-09A, P10B-19A-09B and P10B-19A-09C, P10B-19A-10A and P10B-19A-10B1 are Baseline; parent P10B-19A-09 is Baseline / closed. Parent P10B-19A-10B, P10B-19A-10 and P10B-19A remain Partial, and P10B-19A-10B2 is the exact next implementation task.</w:t>
       </w:r>
     </w:p>
     <w:p>
@@ -12258,7 +12337,7 @@
         <w:rPr>
           <w:rFonts w:ascii="Calibri" w:hAnsi="Calibri" w:cs="Calibri"/>
         </w:rPr>
-        <w:t>P10B-16P-05A removes the active P10B-16L executable-intent route/provider/runtime and isolates P9/Lumo live generation as Deprecated historical, production-disabled evidence. Proven publication and migration fixtures remain where they have current consumers. The P10B-16P-04 Aurum acceptance composition remains production-disabled as the lean mock/live seam retained for P10B-18D. P10B-16P-05B is Baseline after its consumer-verified historical cleanup following accepted P10B-18C. P10B-16P-06 subsequently closes the standalone canonical search query/results adapter, P10B-17 closes responsive/accessibility/performance execution, and the accepted P10B-18A audit freezes the commercial-authority ceiling. Accepted P10B-18B-01 subsequently closes its Design DNA/shared-frame package, accepted P10B-18B-06 closes bounded asset-composition authority, accepted P10B-18B-02 closes bounded homepage/editorial/campaign quality; accepted P10B-18B-03 closes bounded collection/search/product-card quality; and accepted P10B-18B-04 closes bounded PDP quality; accepted P10B-18B-05 closes bounded content/support/utility quality. Parent P10B-18B is Baseline/complete; P10B-18C and P10B-16P-05B are Baseline. P10B-18D is a Baseline diagnostic with live commercial quality rejected. P10B-18 and P10B remain Partial. P10B-19 PRE is Baseline. P10B-19A-01 through P10B-19A-08C are Baseline; parent P10B-19A-08 is Baseline / closed. P10B-19A-09A, P10B-19A-09B, P10B-19A-09C and P10B-19A-10A are Baseline; parent P10B-19A-09 is Baseline / closed. Parent P10B-19A-10 and P10B-19A remain Partial; P10B-19A-10B is the exact next implementation task, A-10C follows, and P10B-19B-01 remains Planned after A-10C.</w:t>
+        <w:t>P10B-16P-05A removes the active P10B-16L executable-intent route/provider/runtime and isolates P9/Lumo live generation as Deprecated historical, production-disabled evidence. Proven publication and migration fixtures remain where they have current consumers. The P10B-16P-04 Aurum acceptance composition remains production-disabled as the lean mock/live seam retained for P10B-18D. P10B-16P-05B is Baseline after its consumer-verified historical cleanup following accepted P10B-18C. P10B-16P-06 subsequently closes the standalone canonical search query/results adapter, P10B-17 closes responsive/accessibility/performance execution, and the accepted P10B-18A audit freezes the commercial-authority ceiling. Accepted P10B-18B-01 subsequently closes its Design DNA/shared-frame package, accepted P10B-18B-06 closes bounded asset-composition authority, accepted P10B-18B-02 closes bounded homepage/editorial/campaign quality; accepted P10B-18B-03 closes bounded collection/search/product-card quality; and accepted P10B-18B-04 closes bounded PDP quality; accepted P10B-18B-05 closes bounded content/support/utility quality. Parent P10B-18B is Baseline/complete; P10B-18C and P10B-16P-05B are Baseline. P10B-18D is a Baseline diagnostic with live commercial quality rejected. P10B-18 and P10B remain Partial. P10B-19 PRE is Baseline. P10B-19A-01 through P10B-19A-08C are Baseline; parent P10B-19A-08 is Baseline / closed. P10B-19A-09A, P10B-19A-09B, P10B-19A-09C, P10B-19A-10A and P10B-19A-10B1 are Baseline; parent P10B-19A-09 is Baseline / closed. Parent P10B-19A-10B, P10B-19A-10 and P10B-19A remain Partial; P10B-19A-10B2 is the exact next implementation task, A-10C follows A-10B2, and P10B-19B-01 remains Planned after A-10C.</w:t>
       </w:r>
     </w:p>
     <w:p>
@@ -12417,7 +12496,7 @@
         <w:rPr>
           <w:rFonts w:ascii="Calibri" w:hAnsi="Calibri" w:cs="Calibri"/>
         </w:rPr>
-        <w:t>This Baseline uses the standalone catalogue adapter only and made zero provider or Vesko calls. It does not claim a Vesko search endpoint, AI/semantic/vector/fuzzy search, typo correction, recommendations, personalization, analytics, or operational commerce writes. P10B-17 subsequently closes the existing responsive/accessibility/performance authority. The accepted P10B-18A audit then freezes the commercial ceiling; accepted P10B-18B-01 closes its Design DNA/shared-frame package; accepted P10B-18B-06 closes bounded asset-composition authority; accepted P10B-18B-02 closes bounded homepage/editorial/campaign quality; accepted P10B-18B-03 closes bounded collection/search/product-card quality; accepted P10B-18B-04 closes bounded PDP quality; and accepted P10B-18B-05 closes bounded content/support/utility quality. Parent P10B-18B is Baseline/complete; P10B-18C and P10B-16P-05B are Baseline. P10B-18D is a Baseline diagnostic with live commercial quality rejected. P10B-18 and P10B remain Partial. P10B-19 PRE is Baseline. P10B-19A-01 through P10B-19A-08C are Baseline; parent P10B-19A-08 is Baseline / closed. P10B-19A-09A, P10B-19A-09B, P10B-19A-09C and P10B-19A-10A are Baseline; parent P10B-19A-09 is Baseline / closed. Parent P10B-19A-10 and P10B-19A remain Partial; P10B-19A-10B is the exact next implementation task, A-10C follows, and P10B-19B-01 remains Planned after A-10C.</w:t>
+        <w:t>This Baseline uses the standalone catalogue adapter only and made zero provider or Vesko calls. It does not claim a Vesko search endpoint, AI/semantic/vector/fuzzy search, typo correction, recommendations, personalization, analytics, or operational commerce writes. P10B-17 subsequently closes the existing responsive/accessibility/performance authority. The accepted P10B-18A audit then freezes the commercial ceiling; accepted P10B-18B-01 closes its Design DNA/shared-frame package; accepted P10B-18B-06 closes bounded asset-composition authority; accepted P10B-18B-02 closes bounded homepage/editorial/campaign quality; accepted P10B-18B-03 closes bounded collection/search/product-card quality; accepted P10B-18B-04 closes bounded PDP quality; and accepted P10B-18B-05 closes bounded content/support/utility quality. Parent P10B-18B is Baseline/complete; P10B-18C and P10B-16P-05B are Baseline. P10B-18D is a Baseline diagnostic with live commercial quality rejected. P10B-18 and P10B remain Partial. P10B-19 PRE is Baseline. P10B-19A-01 through P10B-19A-08C are Baseline; parent P10B-19A-08 is Baseline / closed. P10B-19A-09A, P10B-19A-09B, P10B-19A-09C, P10B-19A-10A and P10B-19A-10B1 are Baseline; parent P10B-19A-09 is Baseline / closed. Parent P10B-19A-10B, P10B-19A-10 and P10B-19A remain Partial; P10B-19A-10B2 is the exact next implementation task, A-10C follows A-10B2, and P10B-19B-01 remains Planned after A-10C.</w:t>
       </w:r>
     </w:p>
     <w:p>
@@ -12619,7 +12698,7 @@
         <w:rPr>
           <w:rFonts w:ascii="Calibri" w:hAnsi="Calibri" w:cs="Calibri"/>
         </w:rPr>
-        <w:t>, accepted on 22 August 2026 after the final 126-case and 280-capture quality/diversity gate. P10B-18D is a Baseline diagnostic with live commercial quality rejected. P10B-19 PRE is Baseline. P10B-19A-01 through P10B-19A-08C are Baseline; parent P10B-19A-08 is Baseline / closed. P10B-19A-09A, P10B-19A-09B, P10B-19A-09C and P10B-19A-10A are Baseline; parent P10B-19A-09 is Baseline / closed. Parent P10B-19A-10 and P10B-19A remain Partial; P10B-19A-10B is the exact next implementation task, A-10C follows, and P10B-19B-01 remains Planned after A-10C. Acceptance of P10B-18B-06 proves only its bounded asset selection, reuse, responsive source/crop, logo-consumer and art-direction authority. Acceptance of P10B-18B-02 proves only bounded homepage, editorial and campaign profile/renderer quality, not parent P10B-18B/P10B-18, later page families or complete-storefront designer-grade quality.</w:t>
+        <w:t>, accepted on 22 August 2026 after the final 126-case and 280-capture quality/diversity gate. P10B-18D is a Baseline diagnostic with live commercial quality rejected. P10B-19 PRE is Baseline. P10B-19A-01 through P10B-19A-08C are Baseline; parent P10B-19A-08 is Baseline / closed. P10B-19A-09A, P10B-19A-09B, P10B-19A-09C, P10B-19A-10A and P10B-19A-10B1 are Baseline; parent P10B-19A-09 is Baseline / closed. Parent P10B-19A-10B, P10B-19A-10 and P10B-19A remain Partial; P10B-19A-10B2 is the exact next implementation task, A-10C follows A-10B2, and P10B-19B-01 remains Planned after A-10C. Acceptance of P10B-18B-06 proves only its bounded asset selection, reuse, responsive source/crop, logo-consumer and art-direction authority. Acceptance of P10B-18B-02 proves only bounded homepage, editorial and campaign profile/renderer quality, not parent P10B-18B/P10B-18, later page families or complete-storefront designer-grade quality.</w:t>
       </w:r>
     </w:p>
     <w:p>
@@ -14113,7 +14192,7 @@
         <w:rPr>
           <w:rFonts w:ascii="Calibri" w:hAnsi="Calibri" w:cs="Calibri"/>
         </w:rPr>
-        <w:t xml:space="preserve"> P10B-01 through P10B-17, P10B-16P-01 through P10B-16P-05A, and P10B-16P-06 are Baseline; P10B-16P-02 is Baseline; accepted P10B-18A and P10B-18B-01/06/02/03/04/05 are Baseline; parent P10B-18B is Baseline/complete. P10B-18C and P10B-16P-05B are Baseline. P10B-18D is a Baseline diagnostic with live commercial quality rejected. P10B-18 and P10B remain Partial. P10B-19 PRE is Baseline. P10B-19A-01 through P10B-19A-08C are Baseline; parent P10B-19A-08 is Baseline / closed. P10B-19A-09A, P10B-19A-09B, P10B-19A-09C and P10B-19A-10A are Baseline; parent P10B-19A-09 is Baseline / closed. Parent P10B-19A-10 and P10B-19A remain Partial; P10B-19A-10B is the exact next implementation task, A-10C follows, and P10B-19B-01 remains Planned after A-10C. Deliver complete commercially credible storefronts with bounded material diversity through registered authority and retained human review.</w:t>
+        <w:t xml:space="preserve"> P10B-01 through P10B-17, P10B-16P-01 through P10B-16P-05A, and P10B-16P-06 are Baseline; P10B-16P-02 is Baseline; accepted P10B-18A and P10B-18B-01/06/02/03/04/05 are Baseline; parent P10B-18B is Baseline/complete. P10B-18C and P10B-16P-05B are Baseline. P10B-18D is a Baseline diagnostic with live commercial quality rejected. P10B-18 and P10B remain Partial. P10B-19 PRE is Baseline. P10B-19A-01 through P10B-19A-08C are Baseline; parent P10B-19A-08 is Baseline / closed. P10B-19A-09A, P10B-19A-09B, P10B-19A-09C, P10B-19A-10A and P10B-19A-10B1 are Baseline; parent P10B-19A-09 is Baseline / closed. Parent P10B-19A-10B, P10B-19A-10 and P10B-19A remain Partial; P10B-19A-10B2 is the exact next implementation task, A-10C follows A-10B2, and P10B-19B-01 remains Planned after A-10C. Deliver complete commercially credible storefronts with bounded material diversity through registered authority and retained human review.</w:t>
       </w:r>
     </w:p>
     <w:p>
@@ -26408,7 +26487,7 @@
         <w:rPr>
           <w:rFonts w:ascii="Calibri" w:hAnsi="Calibri" w:cs="Calibri"/>
         </w:rPr>
-        <w:t>. This adds no second snapshot, page graph, renderer, commerce model, provider path or production evaluation system. P10B-16P-05B subsequently completed the consumer-proven cleanup and is Baseline. P10B-18D live-AI commercial storefront diagnostic is complete with live commercial quality rejected. P10B-19 PRE is Baseline. P10B-19A-01 through P10B-19A-08C are Baseline; parent P10B-19A-08 is Baseline / closed. P10B-19A-09A, P10B-19A-09B, P10B-19A-09C and P10B-19A-10A are Baseline; parent P10B-19A-09 is Baseline / closed. Parent P10B-19A-10 and P10B-19A remain Partial; P10B-19A-10B is the exact next implementation task, A-10C follows, and P10B-19B-01 remains Planned after A-10C.</w:t>
+        <w:t>. This adds no second snapshot, page graph, renderer, commerce model, provider path or production evaluation system. P10B-16P-05B subsequently completed the consumer-proven cleanup and is Baseline. P10B-18D live-AI commercial storefront diagnostic is complete with live commercial quality rejected. P10B-19 PRE is Baseline. P10B-19A-01 through P10B-19A-08C are Baseline; parent P10B-19A-08 is Baseline / closed. P10B-19A-09A, P10B-19A-09B, P10B-19A-09C, P10B-19A-10A and P10B-19A-10B1 are Baseline; parent P10B-19A-09 is Baseline / closed. Parent P10B-19A-10B, P10B-19A-10 and P10B-19A remain Partial; P10B-19A-10B2 is the exact next implementation task, A-10C follows A-10B2, and P10B-19B-01 remains Planned after A-10C.</w:t>
       </w:r>
     </w:p>
     <w:p>
@@ -26457,7 +26536,7 @@
         <w:rPr>
           <w:rFonts w:ascii="Calibri" w:hAnsi="Calibri" w:cs="Calibri"/>
         </w:rPr>
-        <w:t>P10B remains Partial. P10B-18D is a Baseline diagnostic with live commercial quality rejected. The locked order is P10B-19 PRE Baseline; P10B-19A-01 through P10B-19A-07, P10B-19A-08A through P10B-19A-08C, P10B-19A-09A through P10B-19A-09C, and P10B-19A-10A Baseline; parent P10B-19A-08 and P10B-19A-09 Baseline / closed; parent P10B-19A-10 and P10B-19A Partial; P10B-19A-10B exact next; A-10C after A-10B; then P10B-19B-01 and the remaining P10B-19B through P10B-19J work.</w:t>
+        <w:t>P10B remains Partial. P10B-18D is a Baseline diagnostic with live commercial quality rejected. The locked order is P10B-19 PRE Baseline; P10B-19A-01 through P10B-19A-07, P10B-19A-08A through P10B-19A-08C, P10B-19A-09A through P10B-19A-09C, P10B-19A-10A and P10B-19A-10B1 Baseline; parent P10B-19A-08 and P10B-19A-09 Baseline / closed; parent P10B-19A-10B, P10B-19A-10 and P10B-19A Partial; P10B-19A-10B2 exact next; A-10C after A-10B2; then P10B-19B-01 and the remaining P10B-19B through P10B-19J work.</w:t>
       </w:r>
     </w:p>
     <w:p>
@@ -26794,6 +26873,34 @@
           <w:sz w:val="19"/>
           <w:szCs w:val="19"/>
         </w:rPr>
+        <w:t>P10B-19A-10B1 = Baseline</w:t>
+      </w:r>
+      <w:r>
+        <w:rPr>
+          <w:rFonts w:ascii="Calibri" w:hAnsi="Calibri" w:cs="Calibri"/>
+        </w:rPr>
+        <w:t xml:space="preserve">; </w:t>
+      </w:r>
+      <w:r>
+        <w:rPr>
+          <w:rFonts w:ascii="Consolas" w:hAnsi="Consolas" w:cs="Consolas"/>
+          <w:sz w:val="19"/>
+          <w:szCs w:val="19"/>
+        </w:rPr>
+        <w:t>P10B-19A-10B = Partial</w:t>
+      </w:r>
+      <w:r>
+        <w:rPr>
+          <w:rFonts w:ascii="Calibri" w:hAnsi="Calibri" w:cs="Calibri"/>
+        </w:rPr>
+        <w:t xml:space="preserve">; </w:t>
+      </w:r>
+      <w:r>
+        <w:rPr>
+          <w:rFonts w:ascii="Consolas" w:hAnsi="Consolas" w:cs="Consolas"/>
+          <w:sz w:val="19"/>
+          <w:szCs w:val="19"/>
+        </w:rPr>
         <w:t>P10B-19A-10 = Partial</w:t>
       </w:r>
       <w:r>
@@ -26822,7 +26929,7 @@
           <w:sz w:val="19"/>
           <w:szCs w:val="19"/>
         </w:rPr>
-        <w:t>P10B-19A-10B = exact next implementation task</w:t>
+        <w:t>P10B-19A-10B2 = exact next implementation task</w:t>
       </w:r>
       <w:r>
         <w:rPr>
@@ -26836,7 +26943,7 @@
           <w:sz w:val="19"/>
           <w:szCs w:val="19"/>
         </w:rPr>
-        <w:t>P10B-19A-10C = Planned after P10B-19A-10B</w:t>
+        <w:t>P10B-19A-10C = Planned after P10B-19A-10B2</w:t>
       </w:r>
       <w:r>
         <w:rPr>
@@ -27125,7 +27232,7 @@
         <w:rPr>
           <w:rFonts w:ascii="Calibri" w:hAnsi="Calibri" w:cs="Calibri"/>
         </w:rPr>
-        <w:t>, one component registry, canonical Vesko commerce, exact approved media lineage, one deterministic compiler/coordinator, one final materializer/executor, proposal isolation, Accept/Reject, Undo/Redo, Save, reload, Preview, publication, and the Puck adapter boundary remain binding. P10B remains Partial. P10B-19A-01 through P10B-19A-08C are Baseline; parent P10B-19A-08 is Baseline / closed. P10B-19A-09A, P10B-19A-09B and P10B-19A-09C and P10B-19A-10A are Baseline; parent P10B-19A-09 is Baseline / closed. Parent P10B-19A-10 and P10B-19A remain Partial; P10B-19A-10B is the exact next implementation task, P10B-19A-10C is Planned after A-10B, and P10B-19B-01 is Planned after A-10C.</w:t>
+        <w:t>, one component registry, canonical Vesko commerce, exact approved media lineage, one deterministic compiler/coordinator, one final materializer/executor, proposal isolation, Accept/Reject, Undo/Redo, Save, reload, Preview, publication, and the Puck adapter boundary remain binding. P10B remains Partial. P10B-19A-01 through P10B-19A-08C are Baseline; parent P10B-19A-08 is Baseline / closed. P10B-19A-09A, P10B-19A-09B and P10B-19A-09C, P10B-19A-10A and P10B-19A-10B1 are Baseline; parent P10B-19A-09 is Baseline / closed. Parent P10B-19A-10B, P10B-19A-10 and P10B-19A remain Partial; P10B-19A-10B2 is the exact next implementation task, P10B-19A-10C is Planned after A-10B2, and P10B-19B-01 is Planned after A-10C.</w:t>
       </w:r>
     </w:p>
     <w:p>
@@ -31944,6 +32051,34 @@
           <w:sz w:val="19"/>
           <w:szCs w:val="19"/>
         </w:rPr>
+        <w:t>P10B-19A-10B1 = Baseline</w:t>
+      </w:r>
+      <w:r>
+        <w:rPr>
+          <w:rFonts w:ascii="Calibri" w:hAnsi="Calibri" w:cs="Calibri"/>
+        </w:rPr>
+        <w:t xml:space="preserve">; </w:t>
+      </w:r>
+      <w:r>
+        <w:rPr>
+          <w:rFonts w:ascii="Consolas" w:hAnsi="Consolas" w:cs="Consolas"/>
+          <w:sz w:val="19"/>
+          <w:szCs w:val="19"/>
+        </w:rPr>
+        <w:t>P10B-19A-10B = Partial</w:t>
+      </w:r>
+      <w:r>
+        <w:rPr>
+          <w:rFonts w:ascii="Calibri" w:hAnsi="Calibri" w:cs="Calibri"/>
+        </w:rPr>
+        <w:t xml:space="preserve">; </w:t>
+      </w:r>
+      <w:r>
+        <w:rPr>
+          <w:rFonts w:ascii="Consolas" w:hAnsi="Consolas" w:cs="Consolas"/>
+          <w:sz w:val="19"/>
+          <w:szCs w:val="19"/>
+        </w:rPr>
         <w:t>P10B-19A-10 = Partial</w:t>
       </w:r>
       <w:r>
@@ -31972,7 +32107,7 @@
           <w:sz w:val="19"/>
           <w:szCs w:val="19"/>
         </w:rPr>
-        <w:t>P10B-19A-10B = exact next implementation task</w:t>
+        <w:t>P10B-19A-10B2 = exact next implementation task</w:t>
       </w:r>
       <w:r>
         <w:rPr>
@@ -31986,7 +32121,7 @@
           <w:sz w:val="19"/>
           <w:szCs w:val="19"/>
         </w:rPr>
-        <w:t>P10B-19A-10C = Planned after P10B-19A-10B</w:t>
+        <w:t>P10B-19A-10C = Planned after P10B-19A-10B2</w:t>
       </w:r>
       <w:r>
         <w:rPr>
@@ -32511,6 +32646,34 @@
           <w:sz w:val="19"/>
           <w:szCs w:val="19"/>
         </w:rPr>
+        <w:t>P10B-19A-10B1 = Baseline</w:t>
+      </w:r>
+      <w:r>
+        <w:rPr>
+          <w:rFonts w:ascii="Calibri" w:hAnsi="Calibri" w:cs="Calibri"/>
+        </w:rPr>
+        <w:t xml:space="preserve">; </w:t>
+      </w:r>
+      <w:r>
+        <w:rPr>
+          <w:rFonts w:ascii="Consolas" w:hAnsi="Consolas" w:cs="Consolas"/>
+          <w:sz w:val="19"/>
+          <w:szCs w:val="19"/>
+        </w:rPr>
+        <w:t>P10B-19A-10B = Partial</w:t>
+      </w:r>
+      <w:r>
+        <w:rPr>
+          <w:rFonts w:ascii="Calibri" w:hAnsi="Calibri" w:cs="Calibri"/>
+        </w:rPr>
+        <w:t xml:space="preserve">; </w:t>
+      </w:r>
+      <w:r>
+        <w:rPr>
+          <w:rFonts w:ascii="Consolas" w:hAnsi="Consolas" w:cs="Consolas"/>
+          <w:sz w:val="19"/>
+          <w:szCs w:val="19"/>
+        </w:rPr>
         <w:t>P10B-19A-10 = Partial</w:t>
       </w:r>
       <w:r>
@@ -32539,7 +32702,7 @@
           <w:sz w:val="19"/>
           <w:szCs w:val="19"/>
         </w:rPr>
-        <w:t>P10B-19A-10B = exact next implementation task</w:t>
+        <w:t>P10B-19A-10B2 = exact next implementation task</w:t>
       </w:r>
       <w:r>
         <w:rPr>
@@ -32553,7 +32716,7 @@
           <w:sz w:val="19"/>
           <w:szCs w:val="19"/>
         </w:rPr>
-        <w:t>P10B-19A-10C = Planned after P10B-19A-10B</w:t>
+        <w:t>P10B-19A-10C = Planned after P10B-19A-10B2</w:t>
       </w:r>
       <w:r>
         <w:rPr>
@@ -33312,6 +33475,34 @@
           <w:sz w:val="19"/>
           <w:szCs w:val="19"/>
         </w:rPr>
+        <w:t>P10B-19A-10B1 = Baseline</w:t>
+      </w:r>
+      <w:r>
+        <w:rPr>
+          <w:rFonts w:ascii="Calibri" w:hAnsi="Calibri" w:cs="Calibri"/>
+        </w:rPr>
+        <w:t xml:space="preserve">; </w:t>
+      </w:r>
+      <w:r>
+        <w:rPr>
+          <w:rFonts w:ascii="Consolas" w:hAnsi="Consolas" w:cs="Consolas"/>
+          <w:sz w:val="19"/>
+          <w:szCs w:val="19"/>
+        </w:rPr>
+        <w:t>P10B-19A-10B = Partial</w:t>
+      </w:r>
+      <w:r>
+        <w:rPr>
+          <w:rFonts w:ascii="Calibri" w:hAnsi="Calibri" w:cs="Calibri"/>
+        </w:rPr>
+        <w:t xml:space="preserve">; </w:t>
+      </w:r>
+      <w:r>
+        <w:rPr>
+          <w:rFonts w:ascii="Consolas" w:hAnsi="Consolas" w:cs="Consolas"/>
+          <w:sz w:val="19"/>
+          <w:szCs w:val="19"/>
+        </w:rPr>
         <w:t>P10B-19A-10 = Partial</w:t>
       </w:r>
       <w:r>
@@ -33340,7 +33531,7 @@
           <w:sz w:val="19"/>
           <w:szCs w:val="19"/>
         </w:rPr>
-        <w:t>P10B-19A-10B = exact next implementation task</w:t>
+        <w:t>P10B-19A-10B2 = exact next implementation task</w:t>
       </w:r>
       <w:r>
         <w:rPr>
@@ -33354,7 +33545,7 @@
           <w:sz w:val="19"/>
           <w:szCs w:val="19"/>
         </w:rPr>
-        <w:t>P10B-19A-10C = Planned after P10B-19A-10B</w:t>
+        <w:t>P10B-19A-10C = Planned after P10B-19A-10B2</w:t>
       </w:r>
       <w:r>
         <w:rPr>
@@ -33833,6 +34024,34 @@
           <w:sz w:val="19"/>
           <w:szCs w:val="19"/>
         </w:rPr>
+        <w:t>P10B-19A-10B1 = Baseline</w:t>
+      </w:r>
+      <w:r>
+        <w:rPr>
+          <w:rFonts w:ascii="Calibri" w:hAnsi="Calibri" w:cs="Calibri"/>
+        </w:rPr>
+        <w:t xml:space="preserve">; </w:t>
+      </w:r>
+      <w:r>
+        <w:rPr>
+          <w:rFonts w:ascii="Consolas" w:hAnsi="Consolas" w:cs="Consolas"/>
+          <w:sz w:val="19"/>
+          <w:szCs w:val="19"/>
+        </w:rPr>
+        <w:t>P10B-19A-10B = Partial</w:t>
+      </w:r>
+      <w:r>
+        <w:rPr>
+          <w:rFonts w:ascii="Calibri" w:hAnsi="Calibri" w:cs="Calibri"/>
+        </w:rPr>
+        <w:t xml:space="preserve">; </w:t>
+      </w:r>
+      <w:r>
+        <w:rPr>
+          <w:rFonts w:ascii="Consolas" w:hAnsi="Consolas" w:cs="Consolas"/>
+          <w:sz w:val="19"/>
+          <w:szCs w:val="19"/>
+        </w:rPr>
         <w:t>P10B-19A-10 = Partial</w:t>
       </w:r>
       <w:r>
@@ -33861,7 +34080,7 @@
           <w:sz w:val="19"/>
           <w:szCs w:val="19"/>
         </w:rPr>
-        <w:t>P10B-19A-10B = exact next implementation task</w:t>
+        <w:t>P10B-19A-10B2 = exact next implementation task</w:t>
       </w:r>
       <w:r>
         <w:rPr>
@@ -33875,7 +34094,7 @@
           <w:sz w:val="19"/>
           <w:szCs w:val="19"/>
         </w:rPr>
-        <w:t>P10B-19A-10C = Planned after P10B-19A-10B</w:t>
+        <w:t>P10B-19A-10C = Planned after P10B-19A-10B2</w:t>
       </w:r>
       <w:r>
         <w:rPr>
@@ -34290,6 +34509,34 @@
           <w:sz w:val="19"/>
           <w:szCs w:val="19"/>
         </w:rPr>
+        <w:t>P10B-19A-10B1 = Baseline</w:t>
+      </w:r>
+      <w:r>
+        <w:rPr>
+          <w:rFonts w:ascii="Calibri" w:hAnsi="Calibri" w:cs="Calibri"/>
+        </w:rPr>
+        <w:t xml:space="preserve">; </w:t>
+      </w:r>
+      <w:r>
+        <w:rPr>
+          <w:rFonts w:ascii="Consolas" w:hAnsi="Consolas" w:cs="Consolas"/>
+          <w:sz w:val="19"/>
+          <w:szCs w:val="19"/>
+        </w:rPr>
+        <w:t>P10B-19A-10B = Partial</w:t>
+      </w:r>
+      <w:r>
+        <w:rPr>
+          <w:rFonts w:ascii="Calibri" w:hAnsi="Calibri" w:cs="Calibri"/>
+        </w:rPr>
+        <w:t xml:space="preserve">; </w:t>
+      </w:r>
+      <w:r>
+        <w:rPr>
+          <w:rFonts w:ascii="Consolas" w:hAnsi="Consolas" w:cs="Consolas"/>
+          <w:sz w:val="19"/>
+          <w:szCs w:val="19"/>
+        </w:rPr>
         <w:t>P10B-19A-10 = Partial</w:t>
       </w:r>
       <w:r>
@@ -34318,7 +34565,7 @@
           <w:sz w:val="19"/>
           <w:szCs w:val="19"/>
         </w:rPr>
-        <w:t>P10B-19A-10B = exact next implementation task</w:t>
+        <w:t>P10B-19A-10B2 = exact next implementation task</w:t>
       </w:r>
       <w:r>
         <w:rPr>
@@ -34332,7 +34579,7 @@
           <w:sz w:val="19"/>
           <w:szCs w:val="19"/>
         </w:rPr>
-        <w:t>P10B-19A-10C = Planned after P10B-19A-10B</w:t>
+        <w:t>P10B-19A-10C = Planned after P10B-19A-10B2</w:t>
       </w:r>
       <w:r>
         <w:rPr>
@@ -34609,6 +34856,34 @@
           <w:sz w:val="19"/>
           <w:szCs w:val="19"/>
         </w:rPr>
+        <w:t>P10B-19A-10B1 = Baseline</w:t>
+      </w:r>
+      <w:r>
+        <w:rPr>
+          <w:rFonts w:ascii="Calibri" w:hAnsi="Calibri" w:cs="Calibri"/>
+        </w:rPr>
+        <w:t xml:space="preserve">; </w:t>
+      </w:r>
+      <w:r>
+        <w:rPr>
+          <w:rFonts w:ascii="Consolas" w:hAnsi="Consolas" w:cs="Consolas"/>
+          <w:sz w:val="19"/>
+          <w:szCs w:val="19"/>
+        </w:rPr>
+        <w:t>P10B-19A-10B = Partial</w:t>
+      </w:r>
+      <w:r>
+        <w:rPr>
+          <w:rFonts w:ascii="Calibri" w:hAnsi="Calibri" w:cs="Calibri"/>
+        </w:rPr>
+        <w:t xml:space="preserve">; </w:t>
+      </w:r>
+      <w:r>
+        <w:rPr>
+          <w:rFonts w:ascii="Consolas" w:hAnsi="Consolas" w:cs="Consolas"/>
+          <w:sz w:val="19"/>
+          <w:szCs w:val="19"/>
+        </w:rPr>
         <w:t>P10B-19A-10 = Partial</w:t>
       </w:r>
       <w:r>
@@ -34637,7 +34912,7 @@
           <w:sz w:val="19"/>
           <w:szCs w:val="19"/>
         </w:rPr>
-        <w:t>P10B-19A-10B = exact next implementation task</w:t>
+        <w:t>P10B-19A-10B2 = exact next implementation task</w:t>
       </w:r>
       <w:r>
         <w:rPr>
@@ -34651,7 +34926,7 @@
           <w:sz w:val="19"/>
           <w:szCs w:val="19"/>
         </w:rPr>
-        <w:t>P10B-19A-10C = Planned after P10B-19A-10B</w:t>
+        <w:t>P10B-19A-10C = Planned after P10B-19A-10B2</w:t>
       </w:r>
       <w:r>
         <w:rPr>
@@ -34982,6 +35257,34 @@
           <w:sz w:val="19"/>
           <w:szCs w:val="19"/>
         </w:rPr>
+        <w:t>P10B-19A-10B1 = Baseline</w:t>
+      </w:r>
+      <w:r>
+        <w:rPr>
+          <w:rFonts w:ascii="Calibri" w:hAnsi="Calibri" w:cs="Calibri"/>
+        </w:rPr>
+        <w:t xml:space="preserve">; </w:t>
+      </w:r>
+      <w:r>
+        <w:rPr>
+          <w:rFonts w:ascii="Consolas" w:hAnsi="Consolas" w:cs="Consolas"/>
+          <w:sz w:val="19"/>
+          <w:szCs w:val="19"/>
+        </w:rPr>
+        <w:t>P10B-19A-10B = Partial</w:t>
+      </w:r>
+      <w:r>
+        <w:rPr>
+          <w:rFonts w:ascii="Calibri" w:hAnsi="Calibri" w:cs="Calibri"/>
+        </w:rPr>
+        <w:t xml:space="preserve">; </w:t>
+      </w:r>
+      <w:r>
+        <w:rPr>
+          <w:rFonts w:ascii="Consolas" w:hAnsi="Consolas" w:cs="Consolas"/>
+          <w:sz w:val="19"/>
+          <w:szCs w:val="19"/>
+        </w:rPr>
         <w:t>P10B-19A-10 = Partial</w:t>
       </w:r>
       <w:r>
@@ -35010,7 +35313,7 @@
           <w:sz w:val="19"/>
           <w:szCs w:val="19"/>
         </w:rPr>
-        <w:t>P10B-19A-10B = exact next implementation task</w:t>
+        <w:t>P10B-19A-10B2 = exact next implementation task</w:t>
       </w:r>
       <w:r>
         <w:rPr>
@@ -35024,7 +35327,7 @@
           <w:sz w:val="19"/>
           <w:szCs w:val="19"/>
         </w:rPr>
-        <w:t>P10B-19A-10C = Planned after P10B-19A-10B</w:t>
+        <w:t>P10B-19A-10C = Planned after P10B-19A-10B2</w:t>
       </w:r>
       <w:r>
         <w:rPr>
@@ -35083,7 +35386,7 @@
         <w:rPr>
           <w:rFonts w:ascii="Calibri" w:hAnsi="Calibri" w:cs="Calibri"/>
         </w:rPr>
-        <w:t>P10B-19A-10 is delivered through three dependency-ordered children without changing the accepted P10B-19 architecture: A-10A owns the retained inventory and frozen baseline; A-10B owns the cross-authority integration and negative-failure matrix; A-10C owns complete retained execution, the closure report and product-owner architecture gate. A-10A does not prove complete cross-authority integration, A-10B does not close P10B-19A, and only A-10C may close P10B-19A and move exact-next status to P10B-19B-01.</w:t>
+        <w:t>P10B-19A-10 is delivered through three dependency-ordered children without changing the accepted P10B-19 architecture: A-10A owns the retained inventory and frozen baseline; A-10B owns the cross-authority integration and negative-failure matrix; A-10C owns complete retained execution, the closure report and product-owner architecture gate. A-10A does not prove complete cross-authority integration. A-10B is further delivered through A-10B1 positive integration and A-10B2 fail-closed failure coverage and parent closure. A-10B1 does not close A-10B or P10B-19A, and only A-10C may close P10B-19A and move exact-next status to P10B-19B-01.</w:t>
       </w:r>
     </w:p>
     <w:p>
@@ -35311,6 +35614,34 @@
           <w:sz w:val="19"/>
           <w:szCs w:val="19"/>
         </w:rPr>
+        <w:t>P10B-19A-10B1 = Baseline</w:t>
+      </w:r>
+      <w:r>
+        <w:rPr>
+          <w:rFonts w:ascii="Calibri" w:hAnsi="Calibri" w:cs="Calibri"/>
+        </w:rPr>
+        <w:t xml:space="preserve">; </w:t>
+      </w:r>
+      <w:r>
+        <w:rPr>
+          <w:rFonts w:ascii="Consolas" w:hAnsi="Consolas" w:cs="Consolas"/>
+          <w:sz w:val="19"/>
+          <w:szCs w:val="19"/>
+        </w:rPr>
+        <w:t>P10B-19A-10B = Partial</w:t>
+      </w:r>
+      <w:r>
+        <w:rPr>
+          <w:rFonts w:ascii="Calibri" w:hAnsi="Calibri" w:cs="Calibri"/>
+        </w:rPr>
+        <w:t xml:space="preserve">; </w:t>
+      </w:r>
+      <w:r>
+        <w:rPr>
+          <w:rFonts w:ascii="Consolas" w:hAnsi="Consolas" w:cs="Consolas"/>
+          <w:sz w:val="19"/>
+          <w:szCs w:val="19"/>
+        </w:rPr>
         <w:t>P10B-19A-10 = Partial</w:t>
       </w:r>
       <w:r>
@@ -35339,7 +35670,7 @@
           <w:sz w:val="19"/>
           <w:szCs w:val="19"/>
         </w:rPr>
-        <w:t>P10B-19A-10B = exact next implementation task</w:t>
+        <w:t>P10B-19A-10B2 = exact next implementation task</w:t>
       </w:r>
       <w:r>
         <w:rPr>
@@ -35353,7 +35684,268 @@
           <w:sz w:val="19"/>
           <w:szCs w:val="19"/>
         </w:rPr>
-        <w:t>P10B-19A-10C = Planned after P10B-19A-10B</w:t>
+        <w:t>P10B-19A-10C = Planned after P10B-19A-10B2</w:t>
+      </w:r>
+      <w:r>
+        <w:rPr>
+          <w:rFonts w:ascii="Calibri" w:hAnsi="Calibri" w:cs="Calibri"/>
+        </w:rPr>
+        <w:t xml:space="preserve">; </w:t>
+      </w:r>
+      <w:r>
+        <w:rPr>
+          <w:rFonts w:ascii="Consolas" w:hAnsi="Consolas" w:cs="Consolas"/>
+          <w:sz w:val="19"/>
+          <w:szCs w:val="19"/>
+        </w:rPr>
+        <w:t>P10B-19B-01 = Planned after P10B-19A-10C</w:t>
+      </w:r>
+      <w:r>
+        <w:rPr>
+          <w:rFonts w:ascii="Calibri" w:hAnsi="Calibri" w:cs="Calibri"/>
+        </w:rPr>
+        <w:t xml:space="preserve">; </w:t>
+      </w:r>
+      <w:r>
+        <w:rPr>
+          <w:rFonts w:ascii="Consolas" w:hAnsi="Consolas" w:cs="Consolas"/>
+          <w:sz w:val="19"/>
+          <w:szCs w:val="19"/>
+        </w:rPr>
+        <w:t>P10B = Partial</w:t>
+      </w:r>
+      <w:r>
+        <w:rPr>
+          <w:rFonts w:ascii="Calibri" w:hAnsi="Calibri" w:cs="Calibri"/>
+        </w:rPr>
+        <w:t>.</w:t>
+      </w:r>
+    </w:p>
+    <w:p>
+      <w:pPr>
+        <w:pStyle w:val="Heading2"/>
+        <w:keepNext/>
+        <w:widowControl/>
+      </w:pPr>
+      <w:r>
+        <w:rPr>
+          <w:rFonts w:ascii="Calibri" w:hAnsi="Calibri" w:cs="Calibri"/>
+        </w:rPr>
+        <w:t>10.45 P10B-19A-10B1 Positive Cross-Authority Integration Matrix</w:t>
+      </w:r>
+    </w:p>
+    <w:p>
+      <w:pPr>
+        <w:pStyle w:val="Normal"/>
+        <w:widowControl/>
+      </w:pPr>
+      <w:r>
+        <w:rPr>
+          <w:rFonts w:ascii="Calibri" w:hAnsi="Calibri" w:cs="Calibri"/>
+        </w:rPr>
+        <w:t>P10B-19A-10B is delivered through two dependency-ordered, delivery-only children without changing the accepted 73-child P10B-19 architecture. A-10B1 owns positive cross-authority integration. A-10B2 owns the Fail-Closed Cross-Authority Failure Matrix and A-10B Closure.</w:t>
+      </w:r>
+    </w:p>
+    <w:p>
+      <w:pPr>
+        <w:pStyle w:val="Normal"/>
+        <w:widowControl/>
+      </w:pPr>
+      <w:r>
+        <w:rPr>
+          <w:rFonts w:ascii="Calibri" w:hAnsi="Calibri" w:cs="Calibri"/>
+        </w:rPr>
+        <w:t>The checked fixture contains eight PageBlueprint v2 candidates—six primary and two product-detail fallback candidates—six Structural Storefront Family candidates, six compatibility profiles, three capability contexts, six exact family roles/IDs and three normalized family-topology groups of two exact identities. Positive integration proves two-hop product-detail substitution, optional content/support omission, six family-constrained receipts and three sequential pairwise topology-distinct receipts.</w:t>
+      </w:r>
+    </w:p>
+    <w:p>
+      <w:pPr>
+        <w:pStyle w:val="Normal"/>
+        <w:widowControl/>
+      </w:pPr>
+      <w:r>
+        <w:rPr>
+          <w:rFonts w:ascii="Calibri" w:hAnsi="Calibri" w:cs="Calibri"/>
+        </w:rPr>
+        <w:t xml:space="preserve">Direct EN and direct FI each classify all eight PageBlueprint candidates and all six families as directly compatible. Their context and evaluation identities differ, as do the fixture's stable technical request and receipt identities, while normalized structural topology remains locale-independent. Mixed fallback classifies five PageBlueprints directly compatible, two substitution-compatible and one omission-compatible, with all six families conditionally compatible. The fresh-clone authority is checked in at </w:t>
+      </w:r>
+      <w:r>
+        <w:rPr>
+          <w:rFonts w:ascii="Consolas" w:hAnsi="Consolas" w:cs="Consolas"/>
+          <w:sz w:val="19"/>
+          <w:szCs w:val="19"/>
+        </w:rPr>
+        <w:t>tests/fixtures/p10b-19a-10b1-positive-cross-authority-integration.v1.json</w:t>
+      </w:r>
+      <w:r>
+        <w:rPr>
+          <w:rFonts w:ascii="Calibri" w:hAnsi="Calibri" w:cs="Calibri"/>
+        </w:rPr>
+        <w:t>.</w:t>
+      </w:r>
+    </w:p>
+    <w:p>
+      <w:pPr>
+        <w:pStyle w:val="Normal"/>
+        <w:widowControl/>
+      </w:pPr>
+      <w:r>
+        <w:rPr>
+          <w:rFonts w:ascii="Calibri" w:hAnsi="Calibri" w:cs="Calibri"/>
+        </w:rPr>
+        <w:t>A-09 coexistence remains unchanged. The frozen A-10A fixture remains byte-identical with 24 matrix entries, 76 protected production-source hashes and nine production-inactivity assertions. Accepted 126/72 and A-09 metrics remain unchanged. Production files changed remain zero; no v2 production record, current-generation reachability, client-runtime reachability, provider call, Vesko call, external publication, visual behavior or merchant-visible behavior is introduced.</w:t>
+      </w:r>
+    </w:p>
+    <w:p>
+      <w:pPr>
+        <w:pStyle w:val="Normal"/>
+        <w:widowControl/>
+      </w:pPr>
+      <w:r>
+        <w:rPr>
+          <w:rFonts w:ascii="Calibri" w:hAnsi="Calibri" w:cs="Calibri"/>
+        </w:rPr>
+        <w:t xml:space="preserve">The canonical positive-integration baseline fingerprint is </w:t>
+      </w:r>
+      <w:r>
+        <w:rPr>
+          <w:rFonts w:ascii="Consolas" w:hAnsi="Consolas" w:cs="Consolas"/>
+          <w:sz w:val="19"/>
+          <w:szCs w:val="19"/>
+        </w:rPr>
+        <w:t>p10b-19a-positive-cross-authority-integration-v1_23279_e195aad8126b74a9990d923a6ef08d82c637589919f362e8c5e90263092a002d</w:t>
+      </w:r>
+      <w:r>
+        <w:rPr>
+          <w:rFonts w:ascii="Calibri" w:hAnsi="Calibri" w:cs="Calibri"/>
+        </w:rPr>
+        <w:t xml:space="preserve">. The checked fixture SHA-256 is </w:t>
+      </w:r>
+      <w:r>
+        <w:rPr>
+          <w:rFonts w:ascii="Consolas" w:hAnsi="Consolas" w:cs="Consolas"/>
+          <w:sz w:val="19"/>
+          <w:szCs w:val="19"/>
+        </w:rPr>
+        <w:t>907a4d48cab6dacd0bc46e0fb16d4eca2ca82c87d7f00b605ca53f3f112490f2</w:t>
+      </w:r>
+      <w:r>
+        <w:rPr>
+          <w:rFonts w:ascii="Calibri" w:hAnsi="Calibri" w:cs="Calibri"/>
+        </w:rPr>
+        <w:t xml:space="preserve">. The read-only external baseline SHA-256 is </w:t>
+      </w:r>
+      <w:r>
+        <w:rPr>
+          <w:rFonts w:ascii="Consolas" w:hAnsi="Consolas" w:cs="Consolas"/>
+          <w:sz w:val="19"/>
+          <w:szCs w:val="19"/>
+        </w:rPr>
+        <w:t>2f181f551e7b44e5429f3b67cd4f381aaf98fcf996196af75d852e67b3d435ab</w:t>
+      </w:r>
+      <w:r>
+        <w:rPr>
+          <w:rFonts w:ascii="Calibri" w:hAnsi="Calibri" w:cs="Calibri"/>
+        </w:rPr>
+        <w:t xml:space="preserve"> and corroborates the checked authority without becoming a fresh-clone dependency. Fingerprint, fixture, external authority, frozen A-10A identity and semantic outcomes fail closed on drift.</w:t>
+      </w:r>
+    </w:p>
+    <w:p>
+      <w:pPr>
+        <w:pStyle w:val="Normal"/>
+        <w:widowControl/>
+      </w:pPr>
+      <w:r>
+        <w:rPr>
+          <w:rFonts w:ascii="Consolas" w:hAnsi="Consolas" w:cs="Consolas"/>
+          <w:sz w:val="19"/>
+          <w:szCs w:val="19"/>
+        </w:rPr>
+        <w:t>P10B-19A-10A = Baseline</w:t>
+      </w:r>
+      <w:r>
+        <w:rPr>
+          <w:rFonts w:ascii="Calibri" w:hAnsi="Calibri" w:cs="Calibri"/>
+        </w:rPr>
+        <w:t xml:space="preserve">; </w:t>
+      </w:r>
+      <w:r>
+        <w:rPr>
+          <w:rFonts w:ascii="Consolas" w:hAnsi="Consolas" w:cs="Consolas"/>
+          <w:sz w:val="19"/>
+          <w:szCs w:val="19"/>
+        </w:rPr>
+        <w:t>P10B-19A-10B1 = Baseline</w:t>
+      </w:r>
+      <w:r>
+        <w:rPr>
+          <w:rFonts w:ascii="Calibri" w:hAnsi="Calibri" w:cs="Calibri"/>
+        </w:rPr>
+        <w:t xml:space="preserve">; </w:t>
+      </w:r>
+      <w:r>
+        <w:rPr>
+          <w:rFonts w:ascii="Consolas" w:hAnsi="Consolas" w:cs="Consolas"/>
+          <w:sz w:val="19"/>
+          <w:szCs w:val="19"/>
+        </w:rPr>
+        <w:t>P10B-19A-10B = Partial</w:t>
+      </w:r>
+      <w:r>
+        <w:rPr>
+          <w:rFonts w:ascii="Calibri" w:hAnsi="Calibri" w:cs="Calibri"/>
+        </w:rPr>
+        <w:t xml:space="preserve">; </w:t>
+      </w:r>
+      <w:r>
+        <w:rPr>
+          <w:rFonts w:ascii="Consolas" w:hAnsi="Consolas" w:cs="Consolas"/>
+          <w:sz w:val="19"/>
+          <w:szCs w:val="19"/>
+        </w:rPr>
+        <w:t>P10B-19A-10 = Partial</w:t>
+      </w:r>
+      <w:r>
+        <w:rPr>
+          <w:rFonts w:ascii="Calibri" w:hAnsi="Calibri" w:cs="Calibri"/>
+        </w:rPr>
+        <w:t xml:space="preserve">; </w:t>
+      </w:r>
+      <w:r>
+        <w:rPr>
+          <w:rFonts w:ascii="Consolas" w:hAnsi="Consolas" w:cs="Consolas"/>
+          <w:sz w:val="19"/>
+          <w:szCs w:val="19"/>
+        </w:rPr>
+        <w:t>P10B-19A = Partial</w:t>
+      </w:r>
+      <w:r>
+        <w:rPr>
+          <w:rFonts w:ascii="Calibri" w:hAnsi="Calibri" w:cs="Calibri"/>
+        </w:rPr>
+        <w:t xml:space="preserve">; </w:t>
+      </w:r>
+      <w:r>
+        <w:rPr>
+          <w:rFonts w:ascii="Consolas" w:hAnsi="Consolas" w:cs="Consolas"/>
+          <w:sz w:val="19"/>
+          <w:szCs w:val="19"/>
+        </w:rPr>
+        <w:t>P10B-19A-10B2 = exact next implementation task</w:t>
+      </w:r>
+      <w:r>
+        <w:rPr>
+          <w:rFonts w:ascii="Calibri" w:hAnsi="Calibri" w:cs="Calibri"/>
+        </w:rPr>
+        <w:t xml:space="preserve">; </w:t>
+      </w:r>
+      <w:r>
+        <w:rPr>
+          <w:rFonts w:ascii="Consolas" w:hAnsi="Consolas" w:cs="Consolas"/>
+          <w:sz w:val="19"/>
+          <w:szCs w:val="19"/>
+        </w:rPr>
+        <w:t>P10B-19A-10C = Planned after P10B-19A-10B2</w:t>
       </w:r>
       <w:r>
         <w:rPr>

</xml_diff>